<commit_message>
user guide update for gis and attribute
</commit_message>
<xml_diff>
--- a/USER_GUIDE_(UPDATED)V4.docx
+++ b/USER_GUIDE_(UPDATED)V4.docx
@@ -13362,7 +13362,7 @@
               <w:rPr>
                 <w:sz w:val="18"/>
               </w:rPr>
-              <w:t>When "Present": Cycling Path; Red Stripe; Signalised Crossing; Traffic Crossing; Zebra Crossing</w:t>
+              <w:t>When "Present": Cycling Path; Red Stripe; Signalised Crossing; Traffic Crossing; Zebra Crossing &lt;br&gt; When "Not Present": Faded Marking</w:t>
             </w:r>
           </w:p>
         </w:tc>
@@ -13810,7 +13810,19 @@
               <w:rPr>
                 <w:sz w:val="18"/>
               </w:rPr>
-              <w:t>Major Surface Deformation or Drain Opening</w:t>
+              <w:t xml:space="preserve">Major Surface Deformation or Drain Opening </w:t>
+            </w:r>
+            <w:r>
+              <w:rPr>
+                <w:b/>
+                <w:sz w:val="18"/>
+              </w:rPr>
+              <w:t>❖</w:t>
+            </w:r>
+            <w:r>
+              <w:rPr>
+                <w:sz w:val="18"/>
+              </w:rPr>
             </w:r>
           </w:p>
         </w:tc>
@@ -13846,7 +13858,7 @@
               <w:rPr>
                 <w:sz w:val="18"/>
               </w:rPr>
-              <w:t>—</w:t>
+              <w:t>When "Present": Footpath crack; Footpath uneven; Footpath Uneven IMU</w:t>
             </w:r>
           </w:p>
         </w:tc>
@@ -14806,6 +14818,62 @@
               <w:rPr>
                 <w:sz w:val="18"/>
               </w:rPr>
+              <w:t>Delineation</w:t>
+            </w:r>
+          </w:p>
+        </w:tc>
+        <w:tc>
+          <w:tcPr>
+            <w:tcW w:type="dxa" w:w="2880"/>
+          </w:tcPr>
+          <w:p>
+            <w:r>
+              <w:rPr>
+                <w:sz w:val="18"/>
+              </w:rPr>
+            </w:r>
+            <w:r>
+              <w:rPr>
+                <w:sz w:val="18"/>
+              </w:rPr>
+              <w:t>Not Present</w:t>
+            </w:r>
+          </w:p>
+        </w:tc>
+        <w:tc>
+          <w:tcPr>
+            <w:tcW w:type="dxa" w:w="2880"/>
+          </w:tcPr>
+          <w:p>
+            <w:r>
+              <w:rPr>
+                <w:sz w:val="18"/>
+              </w:rPr>
+            </w:r>
+            <w:r>
+              <w:rPr>
+                <w:sz w:val="18"/>
+              </w:rPr>
+              <w:t>Faded Marking</w:t>
+            </w:r>
+          </w:p>
+        </w:tc>
+      </w:tr>
+      <w:tr>
+        <w:tc>
+          <w:tcPr>
+            <w:tcW w:type="dxa" w:w="2880"/>
+          </w:tcPr>
+          <w:p>
+            <w:r>
+              <w:rPr>
+                <w:sz w:val="18"/>
+              </w:rPr>
+            </w:r>
+            <w:r>
+              <w:rPr>
+                <w:sz w:val="18"/>
+              </w:rPr>
               <w:t>Crossing Facility</w:t>
             </w:r>
           </w:p>
@@ -14843,6 +14911,62 @@
                 <w:sz w:val="18"/>
               </w:rPr>
               <w:t>Zebra Crossing; Signalised PC; Bicycle Crossing; Unsignalised Junction; Development Access</w:t>
+            </w:r>
+          </w:p>
+        </w:tc>
+      </w:tr>
+      <w:tr>
+        <w:tc>
+          <w:tcPr>
+            <w:tcW w:type="dxa" w:w="2880"/>
+          </w:tcPr>
+          <w:p>
+            <w:r>
+              <w:rPr>
+                <w:sz w:val="18"/>
+              </w:rPr>
+            </w:r>
+            <w:r>
+              <w:rPr>
+                <w:sz w:val="18"/>
+              </w:rPr>
+              <w:t>Major Surface Deformation or Drain Opening</w:t>
+            </w:r>
+          </w:p>
+        </w:tc>
+        <w:tc>
+          <w:tcPr>
+            <w:tcW w:type="dxa" w:w="2880"/>
+          </w:tcPr>
+          <w:p>
+            <w:r>
+              <w:rPr>
+                <w:sz w:val="18"/>
+              </w:rPr>
+            </w:r>
+            <w:r>
+              <w:rPr>
+                <w:sz w:val="18"/>
+              </w:rPr>
+              <w:t>Present</w:t>
+            </w:r>
+          </w:p>
+        </w:tc>
+        <w:tc>
+          <w:tcPr>
+            <w:tcW w:type="dxa" w:w="2880"/>
+          </w:tcPr>
+          <w:p>
+            <w:r>
+              <w:rPr>
+                <w:sz w:val="18"/>
+              </w:rPr>
+            </w:r>
+            <w:r>
+              <w:rPr>
+                <w:sz w:val="18"/>
+              </w:rPr>
+              <w:t>Footpath crack; Footpath uneven; Footpath Uneven IMU</w:t>
             </w:r>
           </w:p>
         </w:tc>
@@ -15817,7 +15941,7 @@
               <w:rPr>
                 <w:sz w:val="18"/>
               </w:rPr>
-              <w:t>5 delineation types</w:t>
+              <w:t>5 delineation types when Present; 1 type when Not Present</w:t>
             </w:r>
           </w:p>
         </w:tc>
@@ -15886,6 +16010,74 @@
                 <w:sz w:val="18"/>
               </w:rPr>
               <w:t>5 crossing types</w:t>
+            </w:r>
+          </w:p>
+        </w:tc>
+      </w:tr>
+      <w:tr>
+        <w:tc>
+          <w:tcPr>
+            <w:tcW w:type="dxa" w:w="2880"/>
+          </w:tcPr>
+          <w:p>
+            <w:r>
+              <w:rPr>
+                <w:sz w:val="18"/>
+              </w:rPr>
+            </w:r>
+            <w:r>
+              <w:rPr>
+                <w:sz w:val="18"/>
+              </w:rPr>
+            </w:r>
+            <w:r>
+              <w:rPr>
+                <w:b/>
+                <w:sz w:val="18"/>
+              </w:rPr>
+              <w:t>Major Surface Deformation or Drain Opening</w:t>
+            </w:r>
+            <w:r>
+              <w:rPr>
+                <w:sz w:val="18"/>
+              </w:rPr>
+              <w:t xml:space="preserve"> ❖</w:t>
+            </w:r>
+          </w:p>
+        </w:tc>
+        <w:tc>
+          <w:tcPr>
+            <w:tcW w:type="dxa" w:w="2880"/>
+          </w:tcPr>
+          <w:p>
+            <w:r>
+              <w:rPr>
+                <w:sz w:val="18"/>
+              </w:rPr>
+            </w:r>
+            <w:r>
+              <w:rPr>
+                <w:sz w:val="18"/>
+              </w:rPr>
+              <w:t>Present; Not Present</w:t>
+            </w:r>
+          </w:p>
+        </w:tc>
+        <w:tc>
+          <w:tcPr>
+            <w:tcW w:type="dxa" w:w="2880"/>
+          </w:tcPr>
+          <w:p>
+            <w:r>
+              <w:rPr>
+                <w:sz w:val="18"/>
+              </w:rPr>
+            </w:r>
+            <w:r>
+              <w:rPr>
+                <w:sz w:val="18"/>
+              </w:rPr>
+              <w:t>3 deformation types</w:t>
             </w:r>
           </w:p>
         </w:tc>
@@ -16728,6 +16920,80 @@
               <w:rPr>
                 <w:sz w:val="18"/>
               </w:rPr>
+              <w:t>Delineation</w:t>
+            </w:r>
+          </w:p>
+        </w:tc>
+        <w:tc>
+          <w:tcPr>
+            <w:tcW w:type="dxa" w:w="2160"/>
+          </w:tcPr>
+          <w:p>
+            <w:r>
+              <w:rPr>
+                <w:sz w:val="18"/>
+              </w:rPr>
+            </w:r>
+            <w:r>
+              <w:rPr>
+                <w:sz w:val="18"/>
+              </w:rPr>
+              <w:t>Not Present</w:t>
+            </w:r>
+          </w:p>
+        </w:tc>
+        <w:tc>
+          <w:tcPr>
+            <w:tcW w:type="dxa" w:w="2160"/>
+          </w:tcPr>
+          <w:p>
+            <w:r>
+              <w:rPr>
+                <w:sz w:val="18"/>
+              </w:rPr>
+            </w:r>
+            <w:r>
+              <w:rPr>
+                <w:sz w:val="18"/>
+              </w:rPr>
+              <w:t>Faded Marking</w:t>
+            </w:r>
+          </w:p>
+        </w:tc>
+        <w:tc>
+          <w:tcPr>
+            <w:tcW w:type="dxa" w:w="2160"/>
+          </w:tcPr>
+          <w:p>
+            <w:r>
+              <w:rPr>
+                <w:sz w:val="18"/>
+              </w:rPr>
+            </w:r>
+            <w:r>
+              <w:rPr>
+                <w:sz w:val="18"/>
+              </w:rPr>
+              <w:t>Unique colour per type</w:t>
+            </w:r>
+          </w:p>
+        </w:tc>
+      </w:tr>
+      <w:tr>
+        <w:tc>
+          <w:tcPr>
+            <w:tcW w:type="dxa" w:w="2160"/>
+          </w:tcPr>
+          <w:p>
+            <w:r>
+              <w:rPr>
+                <w:sz w:val="18"/>
+              </w:rPr>
+            </w:r>
+            <w:r>
+              <w:rPr>
+                <w:sz w:val="18"/>
+              </w:rPr>
               <w:t>Crossing Facility</w:t>
             </w:r>
           </w:p>
@@ -16765,6 +17031,80 @@
                 <w:sz w:val="18"/>
               </w:rPr>
               <w:t>Zebra Crossing · Signalised PC · Bicycle Crossing · Unsignalised Junction · Development Access</w:t>
+            </w:r>
+          </w:p>
+        </w:tc>
+        <w:tc>
+          <w:tcPr>
+            <w:tcW w:type="dxa" w:w="2160"/>
+          </w:tcPr>
+          <w:p>
+            <w:r>
+              <w:rPr>
+                <w:sz w:val="18"/>
+              </w:rPr>
+            </w:r>
+            <w:r>
+              <w:rPr>
+                <w:sz w:val="18"/>
+              </w:rPr>
+              <w:t>Unique colour per type</w:t>
+            </w:r>
+          </w:p>
+        </w:tc>
+      </w:tr>
+      <w:tr>
+        <w:tc>
+          <w:tcPr>
+            <w:tcW w:type="dxa" w:w="2160"/>
+          </w:tcPr>
+          <w:p>
+            <w:r>
+              <w:rPr>
+                <w:sz w:val="18"/>
+              </w:rPr>
+            </w:r>
+            <w:r>
+              <w:rPr>
+                <w:sz w:val="18"/>
+              </w:rPr>
+              <w:t>Major Surface Deformation or Drain Opening</w:t>
+            </w:r>
+          </w:p>
+        </w:tc>
+        <w:tc>
+          <w:tcPr>
+            <w:tcW w:type="dxa" w:w="2160"/>
+          </w:tcPr>
+          <w:p>
+            <w:r>
+              <w:rPr>
+                <w:sz w:val="18"/>
+              </w:rPr>
+            </w:r>
+            <w:r>
+              <w:rPr>
+                <w:sz w:val="18"/>
+              </w:rPr>
+              <w:t>Present</w:t>
+            </w:r>
+          </w:p>
+        </w:tc>
+        <w:tc>
+          <w:tcPr>
+            <w:tcW w:type="dxa" w:w="2160"/>
+          </w:tcPr>
+          <w:p>
+            <w:r>
+              <w:rPr>
+                <w:sz w:val="18"/>
+              </w:rPr>
+            </w:r>
+            <w:r>
+              <w:rPr>
+                <w:sz w:val="18"/>
+              </w:rPr>
+              <w:t>Footpath crack · Footpath uneven · Footpath Uneven IMU</w:t>
             </w:r>
           </w:p>
         </w:tc>
@@ -22756,7 +23096,7 @@
               <w:rPr>
                 <w:sz w:val="18"/>
               </w:rPr>
-              <w:t>Facility Width, Curvature</w:t>
+              <w:t>Cycling Path Type Reference</w:t>
             </w:r>
           </w:p>
         </w:tc>
@@ -22781,21 +23121,7 @@
                 <w:color w:val="C53030"/>
                 <w:sz w:val="18"/>
               </w:rPr>
-              <w:t>path_width (1)</w:t>
-            </w:r>
-            <w:r>
-              <w:rPr>
-                <w:sz w:val="18"/>
-              </w:rPr>
-              <w:t xml:space="preserve">, </w:t>
-            </w:r>
-            <w:r>
-              <w:rPr>
-                <w:rFonts w:ascii="Courier New" w:hAnsi="Courier New"/>
-                <w:color w:val="C53030"/>
-                <w:sz w:val="18"/>
-              </w:rPr>
-              <w:t>path_type (2)</w:t>
+              <w:t>path_type (1)</w:t>
             </w:r>
             <w:r>
               <w:rPr>

</xml_diff>

<commit_message>
User guide new updates
</commit_message>
<xml_diff>
--- a/USER_GUIDE_(UPDATED)V4.docx
+++ b/USER_GUIDE_(UPDATED)V4.docx
@@ -6051,7 +6051,7 @@
                 <w:color w:val="C53030"/>
                 <w:sz w:val="18"/>
               </w:rPr>
-              <w:t>LinkID_Shape_File</w:t>
+              <w:t>Link Ful</w:t>
             </w:r>
             <w:r>
               <w:rPr>
@@ -6876,6 +6876,142 @@
                 <w:sz w:val="18"/>
               </w:rPr>
               <w:t>Path centreline geometry analysis within 5 m radius (see §2.4.2.2)</w:t>
+            </w:r>
+            <w:r>
+              <w:rPr>
+                <w:sz w:val="18"/>
+              </w:rPr>
+            </w:r>
+          </w:p>
+        </w:tc>
+      </w:tr>
+      <w:tr>
+        <w:tc>
+          <w:tcPr>
+            <w:tcW w:type="dxa" w:w="2880"/>
+          </w:tcPr>
+          <w:p>
+            <w:r>
+              <w:rPr>
+                <w:sz w:val="18"/>
+              </w:rPr>
+              <w:t>Loose or Slippery Surface</w:t>
+            </w:r>
+            <w:r>
+              <w:rPr>
+                <w:sz w:val="18"/>
+              </w:rPr>
+            </w:r>
+          </w:p>
+        </w:tc>
+        <w:tc>
+          <w:tcPr>
+            <w:tcW w:type="dxa" w:w="2880"/>
+          </w:tcPr>
+          <w:p>
+            <w:r>
+              <w:rPr>
+                <w:sz w:val="18"/>
+              </w:rPr>
+              <w:t>Pathwatcher defects layer (algae detections)</w:t>
+            </w:r>
+            <w:r>
+              <w:rPr>
+                <w:sz w:val="18"/>
+              </w:rPr>
+            </w:r>
+            <w:r>
+              <w:rPr>
+                <w:rFonts w:ascii="Courier New" w:hAnsi="Courier New"/>
+                <w:color w:val="C53030"/>
+                <w:sz w:val="18"/>
+              </w:rPr>
+            </w:r>
+            <w:r>
+              <w:rPr>
+                <w:sz w:val="18"/>
+              </w:rPr>
+            </w:r>
+          </w:p>
+        </w:tc>
+        <w:tc>
+          <w:tcPr>
+            <w:tcW w:type="dxa" w:w="2880"/>
+          </w:tcPr>
+          <w:p>
+            <w:r>
+              <w:rPr>
+                <w:sz w:val="18"/>
+              </w:rPr>
+              <w:t>Within 5 m buffer</w:t>
+            </w:r>
+            <w:r>
+              <w:rPr>
+                <w:sz w:val="18"/>
+              </w:rPr>
+            </w:r>
+          </w:p>
+        </w:tc>
+      </w:tr>
+      <w:tr>
+        <w:tc>
+          <w:tcPr>
+            <w:tcW w:type="dxa" w:w="2880"/>
+          </w:tcPr>
+          <w:p>
+            <w:r>
+              <w:rPr>
+                <w:sz w:val="18"/>
+              </w:rPr>
+              <w:t>Road AADT</w:t>
+            </w:r>
+            <w:r>
+              <w:rPr>
+                <w:sz w:val="18"/>
+              </w:rPr>
+            </w:r>
+          </w:p>
+        </w:tc>
+        <w:tc>
+          <w:tcPr>
+            <w:tcW w:type="dxa" w:w="2880"/>
+          </w:tcPr>
+          <w:p>
+            <w:r>
+              <w:rPr>
+                <w:sz w:val="18"/>
+              </w:rPr>
+              <w:t>No GIS auto-code — must be coded manually</w:t>
+            </w:r>
+            <w:r>
+              <w:rPr>
+                <w:sz w:val="18"/>
+              </w:rPr>
+            </w:r>
+            <w:r>
+              <w:rPr>
+                <w:rFonts w:ascii="Courier New" w:hAnsi="Courier New"/>
+                <w:color w:val="C53030"/>
+                <w:sz w:val="18"/>
+              </w:rPr>
+            </w:r>
+            <w:r>
+              <w:rPr>
+                <w:sz w:val="18"/>
+              </w:rPr>
+            </w:r>
+          </w:p>
+        </w:tc>
+        <w:tc>
+          <w:tcPr>
+            <w:tcW w:type="dxa" w:w="2880"/>
+          </w:tcPr>
+          <w:p>
+            <w:r>
+              <w:rPr>
+                <w:sz w:val="18"/>
+              </w:rPr>
+              <w:t>—</w:t>
             </w:r>
             <w:r>
               <w:rPr>
@@ -6961,12 +7097,12 @@
         <w:pStyle w:val="ListBullet"/>
       </w:pPr>
       <w:r>
-        <w:t>Score in relation to distance is calculated using this sigmund curve modified to accept a parameter for number of points</w:t>
-      </w:r>
-    </w:p>
-    <w:p>
-      <w:r>
-        <w:t>Confidence level is not a strict cut off point but instead a point at which the score begins to diminish rapidly, seen by the first curve of the sigmoid below. A higher confidence inversely affects the severity of the curve, resulting in a flatter score distribution and thus more evenly weighted across all distance, i.e. a high confidence of 100 will effectively cause points at 0m and 3m to have identical weightage. The confidence level of 2.87 is determined to be the highest accuracy based on comparisons to testing with personal equipment in my neighborhood (smartwatch's baro altimeter). This value can 100% be refined further, but the largest point of error now isn't my equipment accuracy but much more so the LiDAR accuracy.</w:t>
+        <w:t>Score in relation to distance is calculated using this sigmoid curve modified to accept a parameter for number of points</w:t>
+      </w:r>
+    </w:p>
+    <w:p>
+      <w:r>
+        <w:t>Confidence level is not a strict cut off point but instead a point at which the score begins to diminish rapidly, seen by the first curve of the sigmoid below. A higher confidence inversely affects the severity of the curve, resulting in a flatter score distribution and thus more evenly weighted across all distance, i.e. a high confidence of 100 will effectively cause points at 0m and 3m to have identical weightage. The confidence level of 2.87 is determined to be the highest accuracy based on comparisons to testing with personal equipment in a selected area (smartwatch's baro altimeter). This value can be refined further, but the largest point of error now isn't the testing equipment accuracy but much more so the LiDAR accuracy.</w:t>
       </w:r>
     </w:p>
     <w:p>
@@ -6984,7 +7120,7 @@
     </w:p>
     <w:p>
       <w:r>
-        <w:t>Very hard to give typical range due to the incredible amount of inaccuracy in the LiDAR data, i.e. an average elevation of 50m because the equipment happened to scan a flock of birds. Within Singapore, the expected range is 0m to 15m. Unable to give a picture example of said graph because this is purely computational and for auditing. This graph is not used in final calculations.</w:t>
+        <w:t xml:space="preserve">Within Singapore, the expected elevation range is 0m to 15m. </w:t>
       </w:r>
     </w:p>
     <w:p>
@@ -6997,7 +7133,7 @@
     </w:p>
     <w:p>
       <w:r>
-        <w:t>Points closer to 0m have higher weightage in regards to elevation, based on computed score given the sigmoid function above. To be more specific, I used the inverse distance weighting formula below where E-hat is the resulting estimated elevation (the hat signifies estimated, wi being the weight of point i, and ei being the elevation of point i. Further clarification: weight = score, the number calculted from the sigmoid curve above.</w:t>
+        <w:t>Points closer to 0m have higher weightage in regards to elevation, based on computed score given the sigmoid function above. To be more specific, the inverse distance weighting formula below where E-hat is the resulting estimated elevation (the hat signifies estimated, wi being the weight of point i, and ei being the elevation of point i. Further clarification: weight = score, the number calculated from the sigmoid curve above.</w:t>
       </w:r>
     </w:p>
     <w:p>
@@ -10770,119 +10906,6 @@
         <w:br w:type="page"/>
       </w:r>
     </w:p>
-    <w:p>
-      <w:pPr>
-        <w:pStyle w:val="Heading2"/>
-        <w:spacing w:before="240"/>
-      </w:pPr>
-      <w:r>
-        <w:t>3. Map View &amp; Analysis</w:t>
-      </w:r>
-    </w:p>
-    <w:p>
-      <w:r>
-        <w:t>Map views appear in several PSAT workflows, especially Coding, Path Analysis, Treatment, and GIS Layers.</w:t>
-      </w:r>
-    </w:p>
-    <w:p>
-      <w:pPr>
-        <w:pBdr>
-          <w:bottom w:val="single" w:sz="6" w:space="1" w:color="CCCCCC"/>
-        </w:pBdr>
-        <w:spacing w:after="0"/>
-      </w:pPr>
-    </w:p>
-    <w:p>
-      <w:pPr>
-        <w:pStyle w:val="Heading2"/>
-        <w:spacing w:before="240"/>
-      </w:pPr>
-      <w:r>
-        <w:t>Table of Contents</w:t>
-      </w:r>
-    </w:p>
-    <w:p>
-      <w:pPr>
-        <w:pBdr>
-          <w:bottom w:val="single" w:sz="6" w:space="1" w:color="CCCCCC"/>
-        </w:pBdr>
-        <w:spacing w:after="0"/>
-      </w:pPr>
-    </w:p>
-    <w:p>
-      <w:pPr>
-        <w:pStyle w:val="Heading3"/>
-        <w:spacing w:before="160"/>
-      </w:pPr>
-      <w:r>
-        <w:t>3.1 Segment Map in Coding</w:t>
-      </w:r>
-    </w:p>
-    <w:p>
-      <w:r>
-        <w:t>On the Coding page, the map helps you:</w:t>
-      </w:r>
-    </w:p>
-    <w:p>
-      <w:pPr>
-        <w:pStyle w:val="ListBullet"/>
-      </w:pPr>
-      <w:r>
-        <w:t>click a segment to select it</w:t>
-      </w:r>
-    </w:p>
-    <w:p>
-      <w:pPr>
-        <w:pStyle w:val="ListBullet"/>
-      </w:pPr>
-      <w:r>
-        <w:t>see risk-band colouring for saved scoring results</w:t>
-      </w:r>
-    </w:p>
-    <w:p>
-      <w:pPr>
-        <w:pStyle w:val="ListBullet"/>
-      </w:pPr>
-      <w:r>
-        <w:t>view nearby GIS context for the current point</w:t>
-      </w:r>
-    </w:p>
-    <w:p>
-      <w:pPr>
-        <w:pStyle w:val="ListBullet"/>
-      </w:pPr>
-      <w:r>
-        <w:t>inspect the spatial position of the current segment</w:t>
-      </w:r>
-    </w:p>
-    <w:p>
-      <w:pPr>
-        <w:pStyle w:val="Heading3"/>
-        <w:spacing w:before="160"/>
-      </w:pPr>
-      <w:r>
-        <w:t>3.2 Risk Colour Bands</w:t>
-      </w:r>
-    </w:p>
-    <w:p>
-      <w:r>
-        <w:t xml:space="preserve">Segments are colour-coded by their </w:t>
-      </w:r>
-      <w:r>
-        <w:rPr>
-          <w:b/>
-        </w:rPr>
-        <w:t>highest relevant risk band</w:t>
-      </w:r>
-      <w:r>
-        <w:t xml:space="preserve"> so you can quickly spot high-risk areas.</w:t>
-      </w:r>
-    </w:p>
-    <w:p>
-      <w:r>
-        <w:t>PSAT calculates four independent risk scores per segment:</w:t>
-      </w:r>
-    </w:p>
     <w:tbl>
       <w:tblPr>
         <w:tblStyle w:val="TableGrid"/>
@@ -11134,15 +11157,6 @@
         </w:tc>
       </w:tr>
     </w:tbl>
-    <w:p/>
-    <w:p>
-      <w:pPr>
-        <w:pStyle w:val="Heading4"/>
-      </w:pPr>
-      <w:r>
-        <w:t>Risk Bands for BB, BP, SB</w:t>
-      </w:r>
-    </w:p>
     <w:tbl>
       <w:tblPr>
         <w:tblStyle w:val="TableGrid"/>
@@ -11680,15 +11694,6 @@
         </w:tc>
       </w:tr>
     </w:tbl>
-    <w:p/>
-    <w:p>
-      <w:pPr>
-        <w:pStyle w:val="Heading4"/>
-      </w:pPr>
-      <w:r>
-        <w:t>Risk Bands for VB (Vehicle–Bicyclist)</w:t>
-      </w:r>
-    </w:p>
     <w:tbl>
       <w:tblPr>
         <w:tblStyle w:val="TableGrid"/>
@@ -12226,119 +12231,6 @@
         </w:tc>
       </w:tr>
     </w:tbl>
-    <w:p/>
-    <w:p>
-      <w:pPr>
-        <w:spacing w:before="80" w:after="80"/>
-        <w:ind w:left="504"/>
-        <w:pBdr>
-          <w:left w:val="single" w:sz="12" w:space="4" w:color="3182CE"/>
-        </w:pBdr>
-      </w:pPr>
-      <w:r>
-        <w:rPr>
-          <w:i/>
-          <w:color w:val="4A5568"/>
-        </w:rPr>
-        <w:t>**Overall Risk Level Band** = the **highest** band across BB, BP, SB, and VB for that segment. A single Extreme sub-score makes the overall band Extreme regardless of the others.</w:t>
-      </w:r>
-    </w:p>
-    <w:p>
-      <w:pPr>
-        <w:pStyle w:val="Heading3"/>
-        <w:spacing w:before="160"/>
-      </w:pPr>
-      <w:r>
-        <w:t>3.3 GIS Context</w:t>
-      </w:r>
-    </w:p>
-    <w:p>
-      <w:r>
-        <w:t xml:space="preserve">Depending on the page and workflow, PSAT can show nearby GIS information within a </w:t>
-      </w:r>
-      <w:r>
-        <w:rPr>
-          <w:b/>
-        </w:rPr>
-        <w:t>5 m radius</w:t>
-      </w:r>
-      <w:r>
-        <w:t xml:space="preserve"> of the current segment, such as:</w:t>
-      </w:r>
-    </w:p>
-    <w:p>
-      <w:pPr>
-        <w:pStyle w:val="ListBullet"/>
-      </w:pPr>
-      <w:r>
-        <w:t>cycling paths, shared paths, and footpaths</w:t>
-      </w:r>
-    </w:p>
-    <w:p>
-      <w:pPr>
-        <w:pStyle w:val="ListBullet"/>
-      </w:pPr>
-      <w:r>
-        <w:t>road crossings and zebra crossings</w:t>
-      </w:r>
-    </w:p>
-    <w:p>
-      <w:pPr>
-        <w:pStyle w:val="ListBullet"/>
-      </w:pPr>
-      <w:r>
-        <w:t>bus stops and MRT-related features</w:t>
-      </w:r>
-    </w:p>
-    <w:p>
-      <w:pPr>
-        <w:pStyle w:val="ListBullet"/>
-      </w:pPr>
-      <w:r>
-        <w:t>road-name and planning-area context</w:t>
-      </w:r>
-    </w:p>
-    <w:p>
-      <w:pPr>
-        <w:pStyle w:val="ListBullet"/>
-      </w:pPr>
-      <w:r>
-        <w:t>width, curvature, and gradient analysis overlays</w:t>
-      </w:r>
-    </w:p>
-    <w:p>
-      <w:pPr>
-        <w:pStyle w:val="Heading3"/>
-        <w:spacing w:before="160"/>
-      </w:pPr>
-      <w:r>
-        <w:t>3.4 GIS Layers Page</w:t>
-      </w:r>
-    </w:p>
-    <w:p>
-      <w:r>
-        <w:t xml:space="preserve">Use the dedicated </w:t>
-      </w:r>
-      <w:r>
-        <w:rPr>
-          <w:b/>
-        </w:rPr>
-        <w:t>GIS Layers</w:t>
-      </w:r>
-      <w:r>
-        <w:t xml:space="preserve"> page (accessible from the sidebar) when you want to inspect the raw shapefile layers themselves rather than just the map context around a segment.</w:t>
-      </w:r>
-    </w:p>
-    <w:p>
-      <w:r>
-        <w:t>That page lets you preview available layers, review their metadata, and add or replace GIS files when needed.</w:t>
-      </w:r>
-    </w:p>
-    <w:p>
-      <w:r>
-        <w:br w:type="page"/>
-      </w:r>
-    </w:p>
     <w:p>
       <w:pPr>
         <w:pStyle w:val="Heading2"/>
@@ -15645,51 +15537,6 @@
         <w:spacing w:after="0"/>
       </w:pPr>
     </w:p>
-    <w:p>
-      <w:pPr>
-        <w:pStyle w:val="Heading3"/>
-        <w:spacing w:before="160"/>
-      </w:pPr>
-      <w:r>
-        <w:t>4.6 Finer Filtering Reference</w:t>
-      </w:r>
-    </w:p>
-    <w:p>
-      <w:r>
-        <w:t xml:space="preserve">Finer filtering lets you narrow a segment filter down to a specific </w:t>
-      </w:r>
-      <w:r>
-        <w:rPr>
-          <w:b/>
-        </w:rPr>
-        <w:t>sub-type</w:t>
-      </w:r>
-      <w:r>
-        <w:t xml:space="preserve"> within a parent category. When an attribute supports it, selecting a top-level value reveals a second dropdown — and the map immediately updates to colour only the segments that match your exact sub-type.</w:t>
-      </w:r>
-    </w:p>
-    <w:p>
-      <w:r>
-        <w:t xml:space="preserve">Attributes that support finer filtering are marked </w:t>
-      </w:r>
-      <w:r>
-        <w:rPr>
-          <w:b/>
-        </w:rPr>
-        <w:t>❖</w:t>
-      </w:r>
-      <w:r>
-        <w:t xml:space="preserve"> in the filter panel.</w:t>
-      </w:r>
-    </w:p>
-    <w:p>
-      <w:pPr>
-        <w:pStyle w:val="Heading4"/>
-      </w:pPr>
-      <w:r>
-        <w:t>Which Attributes Support Finer Filtering</w:t>
-      </w:r>
-    </w:p>
     <w:tbl>
       <w:tblPr>
         <w:tblStyle w:val="TableGrid"/>
@@ -16243,138 +16090,6 @@
         </w:tc>
       </w:tr>
     </w:tbl>
-    <w:p/>
-    <w:p>
-      <w:r>
-        <w:t>All other attributes use standard single-level filtering.</w:t>
-      </w:r>
-    </w:p>
-    <w:p>
-      <w:pPr>
-        <w:pStyle w:val="Heading4"/>
-      </w:pPr>
-      <w:r>
-        <w:t>How to Use Finer Filtering</w:t>
-      </w:r>
-    </w:p>
-    <w:p>
-      <w:pPr>
-        <w:pStyle w:val="ListNumber"/>
-      </w:pPr>
-      <w:r>
-        <w:t>Open Path Analysis and load one or more projects.</w:t>
-      </w:r>
-    </w:p>
-    <w:p>
-      <w:pPr>
-        <w:pStyle w:val="ListNumber"/>
-      </w:pPr>
-      <w:r>
-        <w:t xml:space="preserve">In the </w:t>
-      </w:r>
-      <w:r>
-        <w:rPr>
-          <w:b/>
-        </w:rPr>
-        <w:t>Filter Segment</w:t>
-      </w:r>
-      <w:r>
-        <w:t xml:space="preserve"> panel, select an attribute marked </w:t>
-      </w:r>
-      <w:r>
-        <w:rPr>
-          <w:b/>
-        </w:rPr>
-        <w:t>❖</w:t>
-      </w:r>
-      <w:r>
-        <w:t xml:space="preserve"> from the dropdown.</w:t>
-      </w:r>
-    </w:p>
-    <w:p>
-      <w:pPr>
-        <w:pStyle w:val="ListNumber"/>
-      </w:pPr>
-      <w:r>
-        <w:t>Choose a top-level value (e.g. *Present* for Crossing Facility).</w:t>
-      </w:r>
-    </w:p>
-    <w:p>
-      <w:pPr>
-        <w:pStyle w:val="ListNumber"/>
-      </w:pPr>
-      <w:r>
-        <w:t xml:space="preserve">A </w:t>
-      </w:r>
-      <w:r>
-        <w:rPr>
-          <w:b/>
-        </w:rPr>
-        <w:t>sub-category dropdown</w:t>
-      </w:r>
-      <w:r>
-        <w:t xml:space="preserve"> appears immediately below — select the specific sub-type you want (e.g. *Zebra Crossing*).</w:t>
-      </w:r>
-    </w:p>
-    <w:p>
-      <w:pPr>
-        <w:pStyle w:val="ListNumber"/>
-      </w:pPr>
-      <w:r>
-        <w:t>The map updates to colour only segments with that sub-type. Segments with other values are shown in grey.</w:t>
-      </w:r>
-    </w:p>
-    <w:p>
-      <w:pPr>
-        <w:pStyle w:val="ListNumber"/>
-      </w:pPr>
-      <w:r>
-        <w:t xml:space="preserve">To </w:t>
-      </w:r>
-      <w:r>
-        <w:rPr>
-          <w:b/>
-        </w:rPr>
-        <w:t>change</w:t>
-      </w:r>
-      <w:r>
-        <w:t xml:space="preserve"> the sub-category, open the second dropdown and choose a different option.</w:t>
-      </w:r>
-    </w:p>
-    <w:p>
-      <w:pPr>
-        <w:pStyle w:val="ListNumber"/>
-      </w:pPr>
-      <w:r>
-        <w:t xml:space="preserve">To </w:t>
-      </w:r>
-      <w:r>
-        <w:rPr>
-          <w:b/>
-        </w:rPr>
-        <w:t>clear</w:t>
-      </w:r>
-      <w:r>
-        <w:t xml:space="preserve"> finer filtering, click the </w:t>
-      </w:r>
-      <w:r>
-        <w:rPr>
-          <w:b/>
-        </w:rPr>
-        <w:t>×</w:t>
-      </w:r>
-      <w:r>
-        <w:t xml:space="preserve"> on the active filter chip, or reset the top-level value to *Not Selected*.</w:t>
-      </w:r>
-    </w:p>
-    <w:p>
-      <w:pPr>
-        <w:pStyle w:val="Heading4"/>
-      </w:pPr>
-      <w:r>
-        <w:t>Sub-category Reference Table</w:t>
-      </w:r>
-    </w:p>
     <w:tbl>
       <w:tblPr>
         <w:tblStyle w:val="TableGrid"/>
@@ -17288,124 +17003,6 @@
         </w:tc>
       </w:tr>
     </w:tbl>
-    <w:p/>
-    <w:p>
-      <w:pPr>
-        <w:pStyle w:val="Heading4"/>
-      </w:pPr>
-      <w:r>
-        <w:t>Correcting Wrong Sub-category Colours</w:t>
-      </w:r>
-    </w:p>
-    <w:p>
-      <w:r>
-        <w:t>If the map shows unexpected colours when a sub-category filter is active, this usually means the source attribute was coded with an incorrect or missing sub-type value.</w:t>
-      </w:r>
-    </w:p>
-    <w:p>
-      <w:pPr>
-        <w:pStyle w:val="ListNumber"/>
-      </w:pPr>
-      <w:r>
-        <w:t>Click the affected segment on the map to select it.</w:t>
-      </w:r>
-    </w:p>
-    <w:p>
-      <w:pPr>
-        <w:pStyle w:val="ListNumber"/>
-      </w:pPr>
-      <w:r>
-        <w:t xml:space="preserve">Click </w:t>
-      </w:r>
-      <w:r>
-        <w:rPr>
-          <w:b/>
-        </w:rPr>
-        <w:t>Open in Coding</w:t>
-      </w:r>
-      <w:r>
-        <w:t xml:space="preserve"> (or navigate to the Coding page from the sidebar).</w:t>
-      </w:r>
-    </w:p>
-    <w:p>
-      <w:pPr>
-        <w:pStyle w:val="ListNumber"/>
-      </w:pPr>
-      <w:r>
-        <w:t>In the attribute table, find the relevant attribute (e.g. *Fixed Obstacle Type* for Fixed Obstacle on Facility).</w:t>
-      </w:r>
-    </w:p>
-    <w:p>
-      <w:pPr>
-        <w:pStyle w:val="ListNumber"/>
-      </w:pPr>
-      <w:r>
-        <w:t>Correct the value to the appropriate sub-type from the dropdown.</w:t>
-      </w:r>
-    </w:p>
-    <w:p>
-      <w:pPr>
-        <w:pStyle w:val="ListNumber"/>
-      </w:pPr>
-      <w:r>
-        <w:t xml:space="preserve">Click </w:t>
-      </w:r>
-      <w:r>
-        <w:rPr>
-          <w:b/>
-        </w:rPr>
-        <w:t>Save</w:t>
-      </w:r>
-      <w:r>
-        <w:t xml:space="preserve"> to persist the change and recalculate risk scores.</w:t>
-      </w:r>
-    </w:p>
-    <w:p>
-      <w:pPr>
-        <w:pStyle w:val="ListNumber"/>
-      </w:pPr>
-      <w:r>
-        <w:t xml:space="preserve">Click </w:t>
-      </w:r>
-      <w:r>
-        <w:rPr>
-          <w:b/>
-        </w:rPr>
-        <w:t>Back to Analysis</w:t>
-      </w:r>
-      <w:r>
-        <w:t xml:space="preserve"> in the sidebar to return to Path Analysis.</w:t>
-      </w:r>
-    </w:p>
-    <w:p>
-      <w:pPr>
-        <w:pStyle w:val="ListNumber"/>
-      </w:pPr>
-      <w:r>
-        <w:t>Re-apply the same filter — the corrected colour will now appear on the map.</w:t>
-      </w:r>
-    </w:p>
-    <w:p>
-      <w:pPr>
-        <w:spacing w:before="80" w:after="80"/>
-        <w:ind w:left="504"/>
-        <w:pBdr>
-          <w:left w:val="single" w:sz="12" w:space="4" w:color="3182CE"/>
-        </w:pBdr>
-      </w:pPr>
-      <w:r>
-        <w:rPr>
-          <w:i/>
-          <w:color w:val="4A5568"/>
-        </w:rPr>
-        <w:t>This also applies when the CV auto-coder assigns a sub-type incorrectly. The Coding page lets you override any auto-coded value and is the authoritative source for what appears in the filters.</w:t>
-      </w:r>
-    </w:p>
-    <w:p>
-      <w:r>
-        <w:br w:type="page"/>
-      </w:r>
-    </w:p>
     <w:p>
       <w:pPr>
         <w:pStyle w:val="Heading2"/>
@@ -18681,354 +18278,6 @@
         </w:pBdr>
         <w:spacing w:after="0"/>
       </w:pPr>
-    </w:p>
-    <w:p>
-      <w:pPr>
-        <w:pStyle w:val="Heading3"/>
-        <w:spacing w:before="160"/>
-      </w:pPr>
-      <w:r>
-        <w:t>5.10 AI Score Preview — Before &amp; After Treatment</w:t>
-      </w:r>
-    </w:p>
-    <w:p>
-      <w:r>
-        <w:t xml:space="preserve">When you select treatments in the Treatment Options panel, PSAT calculates a </w:t>
-      </w:r>
-      <w:r>
-        <w:rPr>
-          <w:b/>
-        </w:rPr>
-        <w:t>predicted score</w:t>
-      </w:r>
-      <w:r>
-        <w:t xml:space="preserve"> for the current segment in real time. This before/after comparison lets you evaluate the safety impact of a treatment before committing to it.</w:t>
-      </w:r>
-    </w:p>
-    <w:p>
-      <w:pPr>
-        <w:pStyle w:val="Heading4"/>
-      </w:pPr>
-      <w:r>
-        <w:t>How the Before / After Comparison Works</w:t>
-      </w:r>
-    </w:p>
-    <w:p>
-      <w:pPr>
-        <w:pStyle w:val="ListNumber"/>
-      </w:pPr>
-      <w:r/>
-      <w:r>
-        <w:rPr>
-          <w:b/>
-        </w:rPr>
-        <w:t>Before score</w:t>
-      </w:r>
-      <w:r>
-        <w:t xml:space="preserve"> — the original crash type scores (BB, BP, SB, VB, Risk Score) computed from the coded attributes.</w:t>
-      </w:r>
-    </w:p>
-    <w:p>
-      <w:pPr>
-        <w:pStyle w:val="ListNumber"/>
-      </w:pPr>
-      <w:r/>
-      <w:r>
-        <w:rPr>
-          <w:b/>
-        </w:rPr>
-        <w:t>Treatment selected</w:t>
-      </w:r>
-      <w:r>
-        <w:t xml:space="preserve"> — ticking a treatment checkbox immediately previews the effect on the current segment's scores.</w:t>
-      </w:r>
-    </w:p>
-    <w:p>
-      <w:pPr>
-        <w:pStyle w:val="ListNumber"/>
-      </w:pPr>
-      <w:r/>
-      <w:r>
-        <w:rPr>
-          <w:b/>
-        </w:rPr>
-        <w:t>After score</w:t>
-      </w:r>
-      <w:r>
-        <w:t xml:space="preserve"> — PSAT re-runs the CycleRAP scoring formula with the updated attribute values to produce a predicted post-treatment score.</w:t>
-      </w:r>
-    </w:p>
-    <w:p>
-      <w:r>
-        <w:t xml:space="preserve">The difference (reduction) is shown as a </w:t>
-      </w:r>
-      <w:r>
-        <w:rPr>
-          <w:b/>
-        </w:rPr>
-        <w:t>↓ value</w:t>
-      </w:r>
-      <w:r>
-        <w:t xml:space="preserve"> beneath each crash type score card. A green indicator confirms improvement; no arrow means the treatment did not affect that crash type.</w:t>
-      </w:r>
-    </w:p>
-    <w:p>
-      <w:pPr>
-        <w:pStyle w:val="Heading4"/>
-      </w:pPr>
-      <w:r>
-        <w:t>Reading the Score Cards</w:t>
-      </w:r>
-    </w:p>
-    <w:p>
-      <w:r>
-        <w:t>When treatments are selected:</w:t>
-      </w:r>
-    </w:p>
-    <w:p>
-      <w:pPr>
-        <w:pStyle w:val="ListBullet"/>
-      </w:pPr>
-      <w:r>
-        <w:t xml:space="preserve">Each card shows the </w:t>
-      </w:r>
-      <w:r>
-        <w:rPr>
-          <w:b/>
-        </w:rPr>
-        <w:t>post-treatment score</w:t>
-      </w:r>
-      <w:r>
-        <w:t xml:space="preserve"> in large text.</w:t>
-      </w:r>
-    </w:p>
-    <w:p>
-      <w:pPr>
-        <w:pStyle w:val="ListBullet"/>
-      </w:pPr>
-      <w:r>
-        <w:t xml:space="preserve">A </w:t>
-      </w:r>
-      <w:r>
-        <w:rPr>
-          <w:b/>
-        </w:rPr>
-        <w:t>↓ X.XX</w:t>
-      </w:r>
-      <w:r>
-        <w:t xml:space="preserve"> delta beneath it shows how much the score decreased.</w:t>
-      </w:r>
-    </w:p>
-    <w:p>
-      <w:pPr>
-        <w:pStyle w:val="ListBullet"/>
-      </w:pPr>
-      <w:r>
-        <w:t xml:space="preserve">The card background colour reflects the </w:t>
-      </w:r>
-      <w:r>
-        <w:rPr>
-          <w:b/>
-        </w:rPr>
-        <w:t>post-treatment band</w:t>
-      </w:r>
-      <w:r>
-        <w:t xml:space="preserve"> — if a treatment moved a segment from High to Medium, the card will show the Medium (yellow/orange) colour.</w:t>
-      </w:r>
-    </w:p>
-    <w:p>
-      <w:pPr>
-        <w:pStyle w:val="Heading4"/>
-      </w:pPr>
-      <w:r>
-        <w:t>Previewing Before You Apply</w:t>
-      </w:r>
-    </w:p>
-    <w:p>
-      <w:pPr>
-        <w:spacing w:before="80" w:after="80"/>
-        <w:ind w:left="504"/>
-        <w:pBdr>
-          <w:left w:val="single" w:sz="12" w:space="4" w:color="3182CE"/>
-        </w:pBdr>
-      </w:pPr>
-      <w:r>
-        <w:rPr>
-          <w:i/>
-          <w:color w:val="4A5568"/>
-        </w:rPr>
-        <w:t>[!IMPORTANT]</w:t>
-      </w:r>
-    </w:p>
-    <w:p>
-      <w:pPr>
-        <w:spacing w:before="80" w:after="80"/>
-        <w:ind w:left="504"/>
-        <w:pBdr>
-          <w:left w:val="single" w:sz="12" w:space="4" w:color="3182CE"/>
-        </w:pBdr>
-      </w:pPr>
-      <w:r>
-        <w:rPr>
-          <w:i/>
-          <w:color w:val="4A5568"/>
-        </w:rPr>
-        <w:t>The **Show Post-Treatment** toggle must be switched **on** in the Attributes panel header to see the live score preview and attribute modifications. If it is toggled off, the score cards and attribute fields will continue showing the original pre-treatment values.</w:t>
-      </w:r>
-    </w:p>
-    <w:p>
-      <w:r>
-        <w:t xml:space="preserve">With the toggle enabled, tick any treatment checkbox to see the </w:t>
-      </w:r>
-      <w:r>
-        <w:rPr>
-          <w:b/>
-        </w:rPr>
-        <w:t>live score preview</w:t>
-      </w:r>
-      <w:r>
-        <w:t xml:space="preserve"> for the current segment. The scores and attributes update automatically as you change your selection — you do not need to click Apply.</w:t>
-      </w:r>
-    </w:p>
-    <w:p>
-      <w:pPr>
-        <w:spacing w:before="80" w:after="80"/>
-        <w:ind w:left="504"/>
-        <w:pBdr>
-          <w:left w:val="single" w:sz="12" w:space="4" w:color="3182CE"/>
-        </w:pBdr>
-      </w:pPr>
-      <w:r>
-        <w:rPr>
-          <w:i/>
-          <w:color w:val="4A5568"/>
-        </w:rPr>
-        <w:t>**Note:** Selecting treatments only previews the effect — nothing is saved until you click **Apply**.</w:t>
-      </w:r>
-    </w:p>
-    <w:p>
-      <w:pPr>
-        <w:pStyle w:val="Heading4"/>
-      </w:pPr>
-      <w:r>
-        <w:t>AI-Assisted Visualisation (Prompt &amp; Image Copy)</w:t>
-      </w:r>
-    </w:p>
-    <w:p>
-      <w:r>
-        <w:t>Two clipboard buttons help you create visual representations of proposed improvements:</w:t>
-      </w:r>
-    </w:p>
-    <w:p>
-      <w:pPr>
-        <w:pStyle w:val="ListBullet"/>
-      </w:pPr>
-      <w:r/>
-      <w:r>
-        <w:rPr>
-          <w:b/>
-        </w:rPr>
-        <w:t>Copy prompt</w:t>
-      </w:r>
-      <w:r>
-        <w:t xml:space="preserve"> — copies a ready-to-use text prompt describing the selected or applied treatments. Use the dropdown to choose:</w:t>
-      </w:r>
-    </w:p>
-    <w:p>
-      <w:pPr>
-        <w:pStyle w:val="ListBullet2"/>
-      </w:pPr>
-      <w:r/>
-      <w:r>
-        <w:rPr>
-          <w:b/>
-        </w:rPr>
-        <w:t>Copy Applied</w:t>
-      </w:r>
-      <w:r>
-        <w:t xml:space="preserve"> — prompt based on treatments already </w:t>
-      </w:r>
-      <w:r>
-        <w:rPr>
-          <w:b/>
-        </w:rPr>
-        <w:t>applied and saved</w:t>
-      </w:r>
-      <w:r>
-        <w:t xml:space="preserve"> for this segment.</w:t>
-      </w:r>
-    </w:p>
-    <w:p>
-      <w:pPr>
-        <w:pStyle w:val="ListBullet2"/>
-      </w:pPr>
-      <w:r/>
-      <w:r>
-        <w:rPr>
-          <w:b/>
-        </w:rPr>
-        <w:t>Copy Selected</w:t>
-      </w:r>
-      <w:r>
-        <w:t xml:space="preserve"> — prompt based on treatments currently </w:t>
-      </w:r>
-      <w:r>
-        <w:rPr>
-          <w:b/>
-        </w:rPr>
-        <w:t>ticked/selected</w:t>
-      </w:r>
-      <w:r>
-        <w:t xml:space="preserve"> in the panel.</w:t>
-      </w:r>
-    </w:p>
-    <w:p>
-      <w:r>
-        <w:t>Paste the prompt into an AI image generation tool (such as ChatGPT or DALL·E) to generate a mock-up of what the improved path might look like.</w:t>
-      </w:r>
-    </w:p>
-    <w:p>
-      <w:pPr>
-        <w:pStyle w:val="ListBullet"/>
-      </w:pPr>
-      <w:r/>
-      <w:r>
-        <w:rPr>
-          <w:b/>
-        </w:rPr>
-        <w:t>Copy image</w:t>
-      </w:r>
-      <w:r>
-        <w:t xml:space="preserve"> — copies the current segment photograph directly to your clipboard. Paste it alongside the prompt so the AI tool has the actual scene to work from.</w:t>
-      </w:r>
-    </w:p>
-    <w:p>
-      <w:r>
-        <w:t xml:space="preserve">Use </w:t>
-      </w:r>
-      <w:r>
-        <w:rPr>
-          <w:b/>
-        </w:rPr>
-        <w:t>Copy Selected</w:t>
-      </w:r>
-      <w:r>
-        <w:t xml:space="preserve"> when exploring options before committing. Use </w:t>
-      </w:r>
-      <w:r>
-        <w:rPr>
-          <w:b/>
-        </w:rPr>
-        <w:t>Copy Applied</w:t>
-      </w:r>
-      <w:r>
-        <w:t xml:space="preserve"> when generating the final before-and-after visualisation.</w:t>
-      </w:r>
-    </w:p>
-    <w:p>
-      <w:r>
-        <w:br w:type="page"/>
-      </w:r>
     </w:p>
     <w:p>
       <w:pPr>
@@ -21804,7 +21053,7 @@
               <w:rPr>
                 <w:sz w:val="18"/>
               </w:rPr>
-              <w:t>LinkID_Shape_File</w:t>
+              <w:t>Link Ful</w:t>
             </w:r>
           </w:p>
         </w:tc>
@@ -21920,7 +21169,7 @@
               <w:rPr>
                 <w:sz w:val="18"/>
               </w:rPr>
-              <w:t>LinkID_Shape_File</w:t>
+              <w:t>Link Ful</w:t>
             </w:r>
           </w:p>
         </w:tc>

</xml_diff>

<commit_message>
GIS Layer and user guide update
</commit_message>
<xml_diff>
--- a/USER_GUIDE_(UPDATED)V4.docx
+++ b/USER_GUIDE_(UPDATED)V4.docx
@@ -21200,6 +21200,18 @@
     </w:p>
     <w:p>
       <w:pPr>
+        <w:pStyle w:val="ListBullet"/>
+      </w:pPr>
+      <w:r>
+        <w:rPr>
+          <w:b w:val="0"/>
+          <w:i w:val="0"/>
+        </w:rPr>
+        <w:t>6.9 Editing Required Columns and Affects</w:t>
+      </w:r>
+    </w:p>
+    <w:p>
+      <w:pPr>
         <w:pBdr>
           <w:bottom w:val="single" w:sz="6" w:space="1" w:color="A0AEC0"/>
         </w:pBdr>
@@ -23996,6 +24008,104 @@
           <w:b/>
           <w:i w:val="0"/>
         </w:rPr>
+        <w:t>File Upload</w:t>
+      </w:r>
+      <w:r>
+        <w:rPr>
+          <w:b w:val="0"/>
+          <w:i w:val="0"/>
+        </w:rPr>
+        <w:t>: Drag and drop your GIS files, or click to browse. For shapefiles, ensure you upload all companion files together (</w:t>
+      </w:r>
+      <w:r>
+        <w:rPr>
+          <w:rFonts w:ascii="Consolas" w:hAnsi="Consolas"/>
+          <w:b w:val="0"/>
+          <w:i w:val="0"/>
+        </w:rPr>
+        <w:t>.shp</w:t>
+      </w:r>
+      <w:r>
+        <w:rPr>
+          <w:b w:val="0"/>
+          <w:i w:val="0"/>
+        </w:rPr>
+        <w:t xml:space="preserve">, </w:t>
+      </w:r>
+      <w:r>
+        <w:rPr>
+          <w:rFonts w:ascii="Consolas" w:hAnsi="Consolas"/>
+          <w:b w:val="0"/>
+          <w:i w:val="0"/>
+        </w:rPr>
+        <w:t>.shx</w:t>
+      </w:r>
+      <w:r>
+        <w:rPr>
+          <w:b w:val="0"/>
+          <w:i w:val="0"/>
+        </w:rPr>
+        <w:t xml:space="preserve">, </w:t>
+      </w:r>
+      <w:r>
+        <w:rPr>
+          <w:rFonts w:ascii="Consolas" w:hAnsi="Consolas"/>
+          <w:b w:val="0"/>
+          <w:i w:val="0"/>
+        </w:rPr>
+        <w:t>.dbf</w:t>
+      </w:r>
+      <w:r>
+        <w:rPr>
+          <w:b w:val="0"/>
+          <w:i w:val="0"/>
+        </w:rPr>
+        <w:t xml:space="preserve">, </w:t>
+      </w:r>
+      <w:r>
+        <w:rPr>
+          <w:rFonts w:ascii="Consolas" w:hAnsi="Consolas"/>
+          <w:b w:val="0"/>
+          <w:i w:val="0"/>
+        </w:rPr>
+        <w:t>.prj</w:t>
+      </w:r>
+      <w:r>
+        <w:rPr>
+          <w:b w:val="0"/>
+          <w:i w:val="0"/>
+        </w:rPr>
+        <w:t>).</w:t>
+      </w:r>
+    </w:p>
+    <w:p>
+      <w:pPr>
+        <w:pStyle w:val="ListBullet"/>
+      </w:pPr>
+      <w:r>
+        <w:rPr>
+          <w:b/>
+          <w:i w:val="0"/>
+        </w:rPr>
+        <w:t>Preview</w:t>
+      </w:r>
+      <w:r>
+        <w:rPr>
+          <w:b w:val="0"/>
+          <w:i w:val="0"/>
+        </w:rPr>
+        <w:t>: Once files are selected, you can preview the geometry on the map before finalising.</w:t>
+      </w:r>
+    </w:p>
+    <w:p>
+      <w:pPr>
+        <w:pStyle w:val="ListBullet"/>
+      </w:pPr>
+      <w:r>
+        <w:rPr>
+          <w:b/>
+          <w:i w:val="0"/>
+        </w:rPr>
         <w:t>New Category</w:t>
       </w:r>
       <w:r>
@@ -24030,14 +24140,28 @@
           <w:b/>
           <w:i w:val="0"/>
         </w:rPr>
-        <w:t>File Upload</w:t>
-      </w:r>
-      <w:r>
-        <w:rPr>
-          <w:b w:val="0"/>
-          <w:i w:val="0"/>
-        </w:rPr>
-        <w:t>: Drag and drop your GIS files. For shapefiles, ensure you upload all companion files together (</w:t>
+        <w:t>Required Columns</w:t>
+      </w:r>
+      <w:r>
+        <w:rPr>
+          <w:b w:val="0"/>
+          <w:i w:val="0"/>
+        </w:rPr>
+        <w:t xml:space="preserve"> </w:t>
+      </w:r>
+      <w:r>
+        <w:rPr>
+          <w:b w:val="0"/>
+          <w:i/>
+        </w:rPr>
+        <w:t>(optional)</w:t>
+      </w:r>
+      <w:r>
+        <w:rPr>
+          <w:b w:val="0"/>
+          <w:i w:val="0"/>
+        </w:rPr>
+        <w:t xml:space="preserve">: Enter the column name(s) the new layer contains, e.g. </w:t>
       </w:r>
       <w:r>
         <w:rPr>
@@ -24045,7 +24169,54 @@
           <w:b w:val="0"/>
           <w:i w:val="0"/>
         </w:rPr>
-        <w:t>.shp</w:t>
+        <w:t>WIDTH, SURFACE_TYPE</w:t>
+      </w:r>
+      <w:r>
+        <w:rPr>
+          <w:b w:val="0"/>
+          <w:i w:val="0"/>
+        </w:rPr>
+        <w:t>. This field can be left blank if you don't need to record any.</w:t>
+      </w:r>
+    </w:p>
+    <w:p>
+      <w:pPr>
+        <w:pStyle w:val="ListBullet"/>
+      </w:pPr>
+      <w:r>
+        <w:rPr>
+          <w:b/>
+          <w:i w:val="0"/>
+        </w:rPr>
+        <w:t>Affects</w:t>
+      </w:r>
+      <w:r>
+        <w:rPr>
+          <w:b w:val="0"/>
+          <w:i w:val="0"/>
+        </w:rPr>
+        <w:t xml:space="preserve"> </w:t>
+      </w:r>
+      <w:r>
+        <w:rPr>
+          <w:b w:val="0"/>
+          <w:i/>
+        </w:rPr>
+        <w:t>(mandatory)</w:t>
+      </w:r>
+      <w:r>
+        <w:rPr>
+          <w:b w:val="0"/>
+          <w:i w:val="0"/>
+        </w:rPr>
+        <w:t xml:space="preserve">: First choose which category this layer belongs to — </w:t>
+      </w:r>
+      <w:r>
+        <w:rPr>
+          <w:b/>
+          <w:i w:val="0"/>
+        </w:rPr>
+        <w:t>For Auto Coding</w:t>
       </w:r>
       <w:r>
         <w:rPr>
@@ -24056,67 +24227,112 @@
       </w:r>
       <w:r>
         <w:rPr>
+          <w:b/>
+          <w:i w:val="0"/>
+        </w:rPr>
+        <w:t>For Area Based Reports</w:t>
+      </w:r>
+      <w:r>
+        <w:rPr>
+          <w:b w:val="0"/>
+          <w:i w:val="0"/>
+        </w:rPr>
+        <w:t xml:space="preserve">, or </w:t>
+      </w:r>
+      <w:r>
+        <w:rPr>
+          <w:b/>
+          <w:i w:val="0"/>
+        </w:rPr>
+        <w:t>For Analysis</w:t>
+      </w:r>
+      <w:r>
+        <w:rPr>
+          <w:b w:val="0"/>
+          <w:i w:val="0"/>
+        </w:rPr>
+        <w:t xml:space="preserve"> — then tick the specific attribute(s) within that category that this layer affects (e.g. Facility Width, Curvature). To add an attribute that isn't listed, type it into </w:t>
+      </w:r>
+      <w:r>
+        <w:rPr>
+          <w:b/>
+          <w:i w:val="0"/>
+        </w:rPr>
+        <w:t>Add a custom parameter to "…"</w:t>
+      </w:r>
+      <w:r>
+        <w:rPr>
+          <w:b w:val="0"/>
+          <w:i w:val="0"/>
+        </w:rPr>
+        <w:t xml:space="preserve"> and click </w:t>
+      </w:r>
+      <w:r>
+        <w:rPr>
+          <w:b/>
+          <w:i w:val="0"/>
+        </w:rPr>
+        <w:t>Add</w:t>
+      </w:r>
+      <w:r>
+        <w:rPr>
+          <w:b w:val="0"/>
+          <w:i w:val="0"/>
+        </w:rPr>
+        <w:t xml:space="preserve">. Each tick is recorded together with its category, e.g. </w:t>
+      </w:r>
+      <w:r>
+        <w:rPr>
           <w:rFonts w:ascii="Consolas" w:hAnsi="Consolas"/>
           <w:b w:val="0"/>
           <w:i w:val="0"/>
         </w:rPr>
-        <w:t>.shx</w:t>
-      </w:r>
-      <w:r>
-        <w:rPr>
-          <w:b w:val="0"/>
-          <w:i w:val="0"/>
-        </w:rPr>
-        <w:t xml:space="preserve">, </w:t>
-      </w:r>
-      <w:r>
-        <w:rPr>
-          <w:rFonts w:ascii="Consolas" w:hAnsi="Consolas"/>
-          <w:b w:val="0"/>
-          <w:i w:val="0"/>
-        </w:rPr>
-        <w:t>.dbf</w:t>
-      </w:r>
-      <w:r>
-        <w:rPr>
-          <w:b w:val="0"/>
-          <w:i w:val="0"/>
-        </w:rPr>
-        <w:t xml:space="preserve">, </w:t>
-      </w:r>
-      <w:r>
-        <w:rPr>
-          <w:rFonts w:ascii="Consolas" w:hAnsi="Consolas"/>
-          <w:b w:val="0"/>
-          <w:i w:val="0"/>
-        </w:rPr>
-        <w:t>.prj</w:t>
-      </w:r>
-      <w:r>
-        <w:rPr>
-          <w:b w:val="0"/>
-          <w:i w:val="0"/>
-        </w:rPr>
-        <w:t>).</w:t>
-      </w:r>
-    </w:p>
-    <w:p>
-      <w:pPr>
-        <w:pStyle w:val="ListBullet"/>
-      </w:pPr>
+        <w:t>For Auto Coding: Facility Width</w:t>
+      </w:r>
+      <w:r>
+        <w:rPr>
+          <w:b w:val="0"/>
+          <w:i w:val="0"/>
+        </w:rPr>
+        <w:t>, and appears as a removable tag below the checklist. You can switch categories and tick attributes from more than one — at least one attribute must be selected in total before uploading.</w:t>
+      </w:r>
+    </w:p>
+    <w:p>
+      <w:pPr/>
+      <w:r>
+        <w:rPr>
+          <w:b w:val="0"/>
+          <w:i/>
+        </w:rPr>
+        <w:t xml:space="preserve">The </w:t>
+      </w:r>
       <w:r>
         <w:rPr>
           <w:b/>
-          <w:i w:val="0"/>
-        </w:rPr>
-        <w:t>Preview</w:t>
-      </w:r>
-      <w:r>
-        <w:rPr>
-          <w:b w:val="0"/>
-          <w:i w:val="0"/>
-        </w:rPr>
-        <w:t>: Once uploaded, you can preview the geometry on the map before finalising.</w:t>
+          <w:i/>
+        </w:rPr>
+        <w:t>Upload</w:t>
+      </w:r>
+      <w:r>
+        <w:rPr>
+          <w:b w:val="0"/>
+          <w:i/>
+        </w:rPr>
+        <w:t xml:space="preserve"> button stays disabled until you have selected a file and ticked at least one </w:t>
+      </w:r>
+      <w:r>
+        <w:rPr>
+          <w:b/>
+          <w:i/>
+        </w:rPr>
+        <w:t>Affects</w:t>
+      </w:r>
+      <w:r>
+        <w:rPr>
+          <w:b w:val="0"/>
+          <w:i/>
+        </w:rPr>
+        <w:t xml:space="preserve"> attribute.</w:t>
       </w:r>
     </w:p>
     <w:p>
@@ -25410,6 +25626,234 @@
           <w:i/>
         </w:rPr>
         <w:t xml:space="preserve"> button only appears on layers that have been given a custom name. Layers still showing their original name will not have this option.</w:t>
+      </w:r>
+    </w:p>
+    <w:p>
+      <w:pPr>
+        <w:pStyle w:val="Heading2"/>
+      </w:pPr>
+      <w:r>
+        <w:rPr>
+          <w:b w:val="0"/>
+          <w:i w:val="0"/>
+        </w:rPr>
+        <w:t>6.9 Editing Required Columns and Affects</w:t>
+      </w:r>
+    </w:p>
+    <w:p>
+      <w:pPr/>
+      <w:r>
+        <w:rPr>
+          <w:b w:val="0"/>
+          <w:i w:val="0"/>
+        </w:rPr>
+        <w:t xml:space="preserve">The </w:t>
+      </w:r>
+      <w:r>
+        <w:rPr>
+          <w:b/>
+          <w:i w:val="0"/>
+        </w:rPr>
+        <w:t>Required Columns</w:t>
+      </w:r>
+      <w:r>
+        <w:rPr>
+          <w:b w:val="0"/>
+          <w:i w:val="0"/>
+        </w:rPr>
+        <w:t xml:space="preserve"> and </w:t>
+      </w:r>
+      <w:r>
+        <w:rPr>
+          <w:b/>
+          <w:i w:val="0"/>
+        </w:rPr>
+        <w:t>Affects</w:t>
+      </w:r>
+      <w:r>
+        <w:rPr>
+          <w:b w:val="0"/>
+          <w:i w:val="0"/>
+        </w:rPr>
+        <w:t xml:space="preserve"> values you entered while uploading a layer (see </w:t>
+      </w:r>
+      <w:r>
+        <w:rPr>
+          <w:b/>
+          <w:i w:val="0"/>
+        </w:rPr>
+        <w:t>Section 6.3</w:t>
+      </w:r>
+      <w:r>
+        <w:rPr>
+          <w:b w:val="0"/>
+          <w:i w:val="0"/>
+        </w:rPr>
+        <w:t>) can be corrected later if needed.</w:t>
+      </w:r>
+    </w:p>
+    <w:p>
+      <w:pPr/>
+      <w:r>
+        <w:rPr>
+          <w:b/>
+          <w:i w:val="0"/>
+        </w:rPr>
+        <w:t>Steps:</w:t>
+      </w:r>
+    </w:p>
+    <w:p>
+      <w:pPr>
+        <w:pStyle w:val="ListNumber"/>
+      </w:pPr>
+      <w:r>
+        <w:rPr>
+          <w:b w:val="0"/>
+          <w:i w:val="0"/>
+        </w:rPr>
+        <w:t>Open the GIS Layers page from the sidebar</w:t>
+      </w:r>
+    </w:p>
+    <w:p>
+      <w:pPr>
+        <w:pStyle w:val="ListNumber"/>
+      </w:pPr>
+      <w:r>
+        <w:rPr>
+          <w:b w:val="0"/>
+          <w:i w:val="0"/>
+        </w:rPr>
+        <w:t>Locate the layer you want to update</w:t>
+      </w:r>
+    </w:p>
+    <w:p>
+      <w:pPr>
+        <w:pStyle w:val="ListNumber"/>
+      </w:pPr>
+      <w:r>
+        <w:rPr>
+          <w:b w:val="0"/>
+          <w:i w:val="0"/>
+        </w:rPr>
+        <w:t xml:space="preserve">Click the </w:t>
+      </w:r>
+      <w:r>
+        <w:rPr>
+          <w:b/>
+          <w:i w:val="0"/>
+        </w:rPr>
+        <w:t>Params</w:t>
+      </w:r>
+      <w:r>
+        <w:rPr>
+          <w:b w:val="0"/>
+          <w:i w:val="0"/>
+        </w:rPr>
+        <w:t xml:space="preserve"> (or </w:t>
+      </w:r>
+      <w:r>
+        <w:rPr>
+          <w:b/>
+          <w:i w:val="0"/>
+        </w:rPr>
+        <w:t>Edit</w:t>
+      </w:r>
+      <w:r>
+        <w:rPr>
+          <w:b w:val="0"/>
+          <w:i w:val="0"/>
+        </w:rPr>
+        <w:t>) button on the layer row</w:t>
+      </w:r>
+    </w:p>
+    <w:p>
+      <w:pPr>
+        <w:pStyle w:val="ListNumber"/>
+      </w:pPr>
+      <w:r>
+        <w:rPr>
+          <w:b w:val="0"/>
+          <w:i w:val="0"/>
+        </w:rPr>
+        <w:t xml:space="preserve">Update the </w:t>
+      </w:r>
+      <w:r>
+        <w:rPr>
+          <w:b/>
+          <w:i w:val="0"/>
+        </w:rPr>
+        <w:t>Affects</w:t>
+      </w:r>
+      <w:r>
+        <w:rPr>
+          <w:b w:val="0"/>
+          <w:i w:val="0"/>
+        </w:rPr>
+        <w:t xml:space="preserve"> selections and/or </w:t>
+      </w:r>
+      <w:r>
+        <w:rPr>
+          <w:b/>
+          <w:i w:val="0"/>
+        </w:rPr>
+        <w:t>Required Columns</w:t>
+      </w:r>
+      <w:r>
+        <w:rPr>
+          <w:b w:val="0"/>
+          <w:i w:val="0"/>
+        </w:rPr>
+        <w:t xml:space="preserve"> text</w:t>
+      </w:r>
+    </w:p>
+    <w:p>
+      <w:pPr>
+        <w:pStyle w:val="ListNumber"/>
+      </w:pPr>
+      <w:r>
+        <w:rPr>
+          <w:b w:val="0"/>
+          <w:i w:val="0"/>
+        </w:rPr>
+        <w:t xml:space="preserve">Click </w:t>
+      </w:r>
+      <w:r>
+        <w:rPr>
+          <w:b/>
+          <w:i w:val="0"/>
+        </w:rPr>
+        <w:t>Save</w:t>
+      </w:r>
+    </w:p>
+    <w:p>
+      <w:pPr/>
+      <w:r>
+        <w:rPr>
+          <w:b/>
+          <w:i/>
+        </w:rPr>
+        <w:t>Only layers you have uploaded through Add GIS Layer can have their Required Columns / Affects edited.</w:t>
+      </w:r>
+      <w:r>
+        <w:rPr>
+          <w:b w:val="0"/>
+          <w:i/>
+        </w:rPr>
+        <w:t xml:space="preserve"> The built-in shapefiles that ship with PSAT, and any layer that already existed before this feature, are read-only for these two fields — the </w:t>
+      </w:r>
+      <w:r>
+        <w:rPr>
+          <w:b/>
+          <w:i/>
+        </w:rPr>
+        <w:t>Params</w:t>
+      </w:r>
+      <w:r>
+        <w:rPr>
+          <w:b w:val="0"/>
+          <w:i/>
+        </w:rPr>
+        <w:t xml:space="preserve"> button is disabled for them. This does not change what columns the scoring engine actually reads; it only corrects the informational labels shown in the GIS Layers list.</w:t>
       </w:r>
     </w:p>
     <w:sectPr>

</xml_diff>

<commit_message>
Squashed commit of the following:
commit 2c088b28a870fb3cde35610aac1635aa10c8c63c
Author: zacharytxy <23010975@myrp.edu.sg>
Date:   Fri Jul 10 15:26:08 2026 +0800

    User guide update

commit 0a45d00e5642701d025520914bcafdc71f3d6f32
Author: zacharytxy <23010975@myrp.edu.sg>
Date:   Fri Jul 10 14:37:04 2026 +0800

    GIS upload layer fixed

commit e588eeb8b1c25aaa0b99c82a48f3561e506f3797
Merge: 8184c5b 1c569f1
Author: zacharytxy <23010975@myrp.edu.sg>
Date:   Wed Jul 8 16:45:00 2026 +0800

    Merge branch 'al_dev' of https://github.com/LinXH8/PathSafetyAssessmentTool into al_dev

commit 8184c5b5777471403c7f1960214584ebf4677e9f
Author: zacharytxy <23010975@myrp.edu.sg>
Date:   Wed Jul 8 16:44:04 2026 +0800

    GIS Layer and user guide update
</commit_message>
<xml_diff>
--- a/USER_GUIDE_(UPDATED)V4.docx
+++ b/USER_GUIDE_(UPDATED)V4.docx
@@ -1230,11 +1230,14 @@
         <w:t>Where to get the images:</w:t>
       </w:r>
       <w:r>
-        <w:rPr>
-          <w:b w:val="0"/>
-          <w:i w:val="0"/>
-        </w:rPr>
-        <w:t xml:space="preserve"> Survey images are captured using the LTA survey vehicle. The raw image files are provided by the survey team and must be copied into a named sub-folder under </w:t>
+        <w:br/>
+      </w:r>
+      <w:r>
+        <w:rPr>
+          <w:b w:val="0"/>
+          <w:i w:val="0"/>
+        </w:rPr>
+        <w:t xml:space="preserve">Survey images are captured using the LTA survey vehicle. The raw image files are provided by the survey team and must be copied into a named sub-folder under </w:t>
       </w:r>
       <w:r>
         <w:rPr>
@@ -1261,11 +1264,14 @@
         <w:t>How images are auto-named:</w:t>
       </w:r>
       <w:r>
-        <w:rPr>
-          <w:b w:val="0"/>
-          <w:i w:val="0"/>
-        </w:rPr>
-        <w:t xml:space="preserve"> Images are automatically associated with a project and quarter based on two things:</w:t>
+        <w:br/>
+      </w:r>
+      <w:r>
+        <w:rPr>
+          <w:b w:val="0"/>
+          <w:i w:val="0"/>
+        </w:rPr>
+        <w:t>Images are automatically associated with a project and quarter based on two things:</w:t>
       </w:r>
     </w:p>
     <w:p>
@@ -17866,7 +17872,7 @@
             <w:color w:val="2563EB"/>
             <w:u w:val="single"/>
           </w:rPr>
-          <w:t xml:space="preserve">5.6 Saved Reports</w:t>
+          <w:t xml:space="preserve">5.6 Generated Reports</w:t>
         </w:r>
       </w:hyperlink>
     </w:p>
@@ -20407,52 +20413,6 @@
                 <w:b/>
                 <w:i w:val="0"/>
               </w:rPr>
-              <w:t>Hard Save</w:t>
-            </w:r>
-          </w:p>
-        </w:tc>
-        <w:tc>
-          <w:tcPr>
-            <w:tcW w:type="dxa" w:w="4320"/>
-          </w:tcPr>
-          <w:p>
-            <w:r/>
-            <w:r>
-              <w:rPr>
-                <w:b w:val="0"/>
-                <w:i w:val="0"/>
-              </w:rPr>
-              <w:t xml:space="preserve">Use </w:t>
-            </w:r>
-            <w:r>
-              <w:rPr>
-                <w:b/>
-                <w:i w:val="0"/>
-              </w:rPr>
-              <w:t>Save Report</w:t>
-            </w:r>
-            <w:r>
-              <w:rPr>
-                <w:b w:val="0"/>
-                <w:i w:val="0"/>
-              </w:rPr>
-              <w:t xml:space="preserve"> to permanently save the report to the system — it will persist across sessions and can be revisited at any time</w:t>
-            </w:r>
-          </w:p>
-        </w:tc>
-      </w:tr>
-      <w:tr>
-        <w:tc>
-          <w:tcPr>
-            <w:tcW w:type="dxa" w:w="4320"/>
-          </w:tcPr>
-          <w:p>
-            <w:r/>
-            <w:r>
-              <w:rPr>
-                <w:b/>
-                <w:i w:val="0"/>
-              </w:rPr>
               <w:t>Reset layout</w:t>
             </w:r>
           </w:p>
@@ -20607,42 +20567,84 @@
           <w:b/>
           <w:i/>
         </w:rPr>
-        <w:t>Hard Save vs. Layout Save:</w:t>
+        <w:t>PDF exports are auto-archived.</w:t>
       </w:r>
       <w:r>
         <w:rPr>
           <w:b w:val="0"/>
           <w:i/>
         </w:rPr>
-        <w:t xml:space="preserve"> </w:t>
-      </w:r>
-      <w:r>
-        <w:rPr>
-          <w:b w:val="0"/>
+        <w:t xml:space="preserve"> Every time you click </w:t>
+      </w:r>
+      <w:r>
+        <w:rPr>
+          <w:b/>
           <w:i/>
         </w:rPr>
-        <w:t>Save layout</w:t>
+        <w:t>↓ PDF</w:t>
       </w:r>
       <w:r>
         <w:rPr>
           <w:b w:val="0"/>
           <w:i/>
         </w:rPr>
-        <w:t xml:space="preserve"> stores your preferences locally in the browser only (cleared if you clear browser data). </w:t>
-      </w:r>
-      <w:r>
-        <w:rPr>
-          <w:b w:val="0"/>
+        <w:t xml:space="preserve">, PSAT downloads the file to your browser </w:t>
+      </w:r>
+      <w:r>
+        <w:rPr>
+          <w:b/>
           <w:i/>
         </w:rPr>
-        <w:t>Hard Save</w:t>
+        <w:t>and</w:t>
       </w:r>
       <w:r>
         <w:rPr>
           <w:b w:val="0"/>
           <w:i/>
         </w:rPr>
-        <w:t xml:space="preserve"> writes the report to the server so you can return to it from any device or session.</w:t>
+        <w:t xml:space="preserve"> silently saves a timestamped copy to the server's </w:t>
+      </w:r>
+      <w:r>
+        <w:rPr>
+          <w:b/>
+          <w:i/>
+        </w:rPr>
+        <w:t>Generated Reports</w:t>
+      </w:r>
+      <w:r>
+        <w:rPr>
+          <w:b w:val="0"/>
+          <w:i/>
+        </w:rPr>
+        <w:t xml:space="preserve"> page (see Section 5.6), so you can come back and re-download or preview it later without regenerating it. This auto-save only happens for </w:t>
+      </w:r>
+      <w:r>
+        <w:rPr>
+          <w:b/>
+          <w:i/>
+        </w:rPr>
+        <w:t>↓ PDF</w:t>
+      </w:r>
+      <w:r>
+        <w:rPr>
+          <w:b w:val="0"/>
+          <w:i/>
+        </w:rPr>
+        <w:t xml:space="preserve"> — </w:t>
+      </w:r>
+      <w:r>
+        <w:rPr>
+          <w:b/>
+          <w:i/>
+        </w:rPr>
+        <w:t>↓ Word</w:t>
+      </w:r>
+      <w:r>
+        <w:rPr>
+          <w:b w:val="0"/>
+          <w:i/>
+        </w:rPr>
+        <w:t xml:space="preserve"> downloads are not archived.</w:t>
       </w:r>
     </w:p>
     <w:p>
@@ -20663,30 +20665,68 @@
           <w:b w:val="0"/>
           <w:i w:val="0"/>
         </w:rPr>
-        <w:t>5.6 Saved Reports</w:t>
-      </w:r>
-    </w:p>
-    <w:p>
-      <w:r>
-        <w:rPr>
-          <w:b w:val="0"/>
-          <w:i w:val="0"/>
-        </w:rPr>
-        <w:t xml:space="preserve">A </w:t>
+        <w:t>5.6 Generated Reports</w:t>
+      </w:r>
+    </w:p>
+    <w:p>
+      <w:r>
+        <w:rPr>
+          <w:b w:val="0"/>
+          <w:i w:val="0"/>
+        </w:rPr>
+        <w:t xml:space="preserve">Every PDF you export from the Report Builder is saved here automatically, so you don't need to keep track of downloaded files yourself. Access it from the </w:t>
       </w:r>
       <w:r>
         <w:rPr>
           <w:b/>
           <w:i w:val="0"/>
         </w:rPr>
-        <w:t>Saved Reports</w:t>
-      </w:r>
-      <w:r>
-        <w:rPr>
-          <w:b w:val="0"/>
-          <w:i w:val="0"/>
-        </w:rPr>
-        <w:t xml:space="preserve"> list shows all reports that have been hard-saved for your projects. From this list you can:</w:t>
+        <w:t>Generated Reports</w:t>
+      </w:r>
+      <w:r>
+        <w:rPr>
+          <w:b w:val="0"/>
+          <w:i w:val="0"/>
+        </w:rPr>
+        <w:t xml:space="preserve"> button in the sidebar (below </w:t>
+      </w:r>
+      <w:r>
+        <w:rPr>
+          <w:b/>
+          <w:i w:val="0"/>
+        </w:rPr>
+        <w:t>GIS Layers</w:t>
+      </w:r>
+      <w:r>
+        <w:rPr>
+          <w:b w:val="0"/>
+          <w:i w:val="0"/>
+        </w:rPr>
+        <w:t xml:space="preserve"> / </w:t>
+      </w:r>
+      <w:r>
+        <w:rPr>
+          <w:b/>
+          <w:i w:val="0"/>
+        </w:rPr>
+        <w:t>User Guide</w:t>
+      </w:r>
+      <w:r>
+        <w:rPr>
+          <w:b w:val="0"/>
+          <w:i w:val="0"/>
+        </w:rPr>
+        <w:t>).</w:t>
+      </w:r>
+    </w:p>
+    <w:p>
+      <w:pPr/>
+      <w:r>
+        <w:rPr>
+          <w:b/>
+          <w:i w:val="0"/>
+        </w:rPr>
+        <w:t>Saved Reports list (left panel):</w:t>
       </w:r>
     </w:p>
     <w:p>
@@ -20695,17 +20735,81 @@
       </w:pPr>
       <w:r>
         <w:rPr>
+          <w:b w:val="0"/>
+          <w:i w:val="0"/>
+        </w:rPr>
+        <w:t xml:space="preserve">Each entry shows the saved </w:t>
+      </w:r>
+      <w:r>
+        <w:rPr>
           <w:b/>
           <w:i w:val="0"/>
         </w:rPr>
-        <w:t>Browse</w:t>
-      </w:r>
-      <w:r>
-        <w:rPr>
-          <w:b w:val="0"/>
-          <w:i w:val="0"/>
-        </w:rPr>
-        <w:t xml:space="preserve"> previously saved reports, shown with their report name, associated project(s), and the date last saved</w:t>
+        <w:t>filename</w:t>
+      </w:r>
+      <w:r>
+        <w:rPr>
+          <w:b w:val="0"/>
+          <w:i w:val="0"/>
+        </w:rPr>
+        <w:t xml:space="preserve"> (auto-named </w:t>
+      </w:r>
+      <w:r>
+        <w:rPr>
+          <w:rFonts w:ascii="Consolas" w:hAnsi="Consolas"/>
+          <w:b w:val="0"/>
+          <w:i w:val="0"/>
+        </w:rPr>
+        <w:t>PSAT_Report_&lt;timestamp&gt;.pdf</w:t>
+      </w:r>
+      <w:r>
+        <w:rPr>
+          <w:b w:val="0"/>
+          <w:i w:val="0"/>
+        </w:rPr>
+        <w:t xml:space="preserve">), a </w:t>
+      </w:r>
+      <w:r>
+        <w:rPr>
+          <w:b/>
+          <w:i w:val="0"/>
+        </w:rPr>
+        <w:t>PDF</w:t>
+      </w:r>
+      <w:r>
+        <w:rPr>
+          <w:b w:val="0"/>
+          <w:i w:val="0"/>
+        </w:rPr>
+        <w:t xml:space="preserve"> badge, the </w:t>
+      </w:r>
+      <w:r>
+        <w:rPr>
+          <w:b/>
+          <w:i w:val="0"/>
+        </w:rPr>
+        <w:t>file size</w:t>
+      </w:r>
+      <w:r>
+        <w:rPr>
+          <w:b w:val="0"/>
+          <w:i w:val="0"/>
+        </w:rPr>
+        <w:t xml:space="preserve">, and the </w:t>
+      </w:r>
+      <w:r>
+        <w:rPr>
+          <w:b/>
+          <w:i w:val="0"/>
+        </w:rPr>
+        <w:t>date/time it was saved</w:t>
+      </w:r>
+      <w:r>
+        <w:rPr>
+          <w:b w:val="0"/>
+          <w:i w:val="0"/>
+        </w:rPr>
+        <w:t xml:space="preserve"> — newest first</w:t>
       </w:r>
     </w:p>
     <w:p>
@@ -20714,17 +20818,24 @@
       </w:pPr>
       <w:r>
         <w:rPr>
+          <w:b w:val="0"/>
+          <w:i w:val="0"/>
+        </w:rPr>
+        <w:t xml:space="preserve">Use the </w:t>
+      </w:r>
+      <w:r>
+        <w:rPr>
           <w:b/>
           <w:i w:val="0"/>
         </w:rPr>
-        <w:t>Open</w:t>
-      </w:r>
-      <w:r>
-        <w:rPr>
-          <w:b w:val="0"/>
-          <w:i w:val="0"/>
-        </w:rPr>
-        <w:t xml:space="preserve"> any saved report to reload it in the Report Builder — your section layout, field values, and visibility settings are restored exactly as saved</w:t>
+        <w:t>Filter reports…</w:t>
+      </w:r>
+      <w:r>
+        <w:rPr>
+          <w:b w:val="0"/>
+          <w:i w:val="0"/>
+        </w:rPr>
+        <w:t xml:space="preserve"> box to narrow the list by filename</w:t>
       </w:r>
     </w:p>
     <w:p>
@@ -20733,17 +20844,24 @@
       </w:pPr>
       <w:r>
         <w:rPr>
+          <w:b w:val="0"/>
+          <w:i w:val="0"/>
+        </w:rPr>
+        <w:t xml:space="preserve">Click a report to select it and load a </w:t>
+      </w:r>
+      <w:r>
+        <w:rPr>
           <w:b/>
           <w:i w:val="0"/>
         </w:rPr>
-        <w:t>Re-export</w:t>
-      </w:r>
-      <w:r>
-        <w:rPr>
-          <w:b w:val="0"/>
-          <w:i w:val="0"/>
-        </w:rPr>
-        <w:t xml:space="preserve"> a revisited report to PDF or Word without rebuilding it from scratch</w:t>
+        <w:t>preview</w:t>
+      </w:r>
+      <w:r>
+        <w:rPr>
+          <w:b w:val="0"/>
+          <w:i w:val="0"/>
+        </w:rPr>
+        <w:t xml:space="preserve"> in the right panel (an embedded PDF viewer)</w:t>
       </w:r>
     </w:p>
     <w:p>
@@ -20752,9 +20870,70 @@
       </w:pPr>
       <w:r>
         <w:rPr>
+          <w:b w:val="0"/>
+          <w:i w:val="0"/>
+        </w:rPr>
+        <w:t xml:space="preserve">Click the </w:t>
+      </w:r>
+      <w:r>
+        <w:rPr>
           <w:b/>
           <w:i w:val="0"/>
         </w:rPr>
+        <w:t>↓</w:t>
+      </w:r>
+      <w:r>
+        <w:rPr>
+          <w:b w:val="0"/>
+          <w:i w:val="0"/>
+        </w:rPr>
+        <w:t xml:space="preserve"> icon on a report row, or </w:t>
+      </w:r>
+      <w:r>
+        <w:rPr>
+          <w:b/>
+          <w:i w:val="0"/>
+        </w:rPr>
+        <w:t>Download</w:t>
+      </w:r>
+      <w:r>
+        <w:rPr>
+          <w:b w:val="0"/>
+          <w:i w:val="0"/>
+        </w:rPr>
+        <w:t xml:space="preserve"> in the preview header, to download that file</w:t>
+      </w:r>
+    </w:p>
+    <w:p>
+      <w:pPr>
+        <w:pStyle w:val="ListBullet"/>
+      </w:pPr>
+      <w:r>
+        <w:rPr>
+          <w:b w:val="0"/>
+          <w:i w:val="0"/>
+        </w:rPr>
+        <w:t xml:space="preserve">Click the </w:t>
+      </w:r>
+      <w:r>
+        <w:rPr>
+          <w:b/>
+          <w:i w:val="0"/>
+        </w:rPr>
+        <w:t>✕</w:t>
+      </w:r>
+      <w:r>
+        <w:rPr>
+          <w:b w:val="0"/>
+          <w:i w:val="0"/>
+        </w:rPr>
+        <w:t xml:space="preserve"> icon on a report row, or </w:t>
+      </w:r>
+      <w:r>
+        <w:rPr>
+          <w:b/>
+          <w:i w:val="0"/>
+        </w:rPr>
         <w:t>Delete</w:t>
       </w:r>
       <w:r>
@@ -20762,7 +20941,61 @@
           <w:b w:val="0"/>
           <w:i w:val="0"/>
         </w:rPr>
-        <w:t xml:space="preserve"> a saved report you no longer need</w:t>
+        <w:t xml:space="preserve"> in the preview header, to remove a report — you'll be asked to confirm (</w:t>
+      </w:r>
+      <w:r>
+        <w:rPr>
+          <w:b/>
+          <w:i w:val="0"/>
+        </w:rPr>
+        <w:t>Yes</w:t>
+      </w:r>
+      <w:r>
+        <w:rPr>
+          <w:b w:val="0"/>
+          <w:i w:val="0"/>
+        </w:rPr>
+        <w:t xml:space="preserve"> / </w:t>
+      </w:r>
+      <w:r>
+        <w:rPr>
+          <w:b/>
+          <w:i w:val="0"/>
+        </w:rPr>
+        <w:t>No</w:t>
+      </w:r>
+      <w:r>
+        <w:rPr>
+          <w:b w:val="0"/>
+          <w:i w:val="0"/>
+        </w:rPr>
+        <w:t>) before it's deleted</w:t>
+      </w:r>
+    </w:p>
+    <w:p>
+      <w:pPr>
+        <w:pStyle w:val="ListBullet"/>
+      </w:pPr>
+      <w:r>
+        <w:rPr>
+          <w:b w:val="0"/>
+          <w:i w:val="0"/>
+        </w:rPr>
+        <w:t xml:space="preserve">Click </w:t>
+      </w:r>
+      <w:r>
+        <w:rPr>
+          <w:b/>
+          <w:i w:val="0"/>
+        </w:rPr>
+        <w:t>Refresh</w:t>
+      </w:r>
+      <w:r>
+        <w:rPr>
+          <w:b w:val="0"/>
+          <w:i w:val="0"/>
+        </w:rPr>
+        <w:t xml:space="preserve"> (top-right of the page) to reload the list, e.g. after exporting a new report from another tab</w:t>
       </w:r>
     </w:p>
     <w:p>
@@ -20775,9 +21008,61 @@
       <w:r>
         <w:rPr>
           <w:b w:val="0"/>
+          <w:i w:val="0"/>
+        </w:rPr>
+        <w:t xml:space="preserve">If no reports have been saved yet, the list shows: </w:t>
+      </w:r>
+      <w:r>
+        <w:rPr>
+          <w:b w:val="0"/>
           <w:i/>
         </w:rPr>
-        <w:t>Saved reports capture a snapshot of the data at the time of saving. If you update project data or re-code segments after saving, re-open the report and save again to refresh it.</w:t>
+        <w:t>"No reports found. Download a PDF from the Report Builder to save one here."</w:t>
+      </w:r>
+    </w:p>
+    <w:p>
+      <w:pPr/>
+      <w:r>
+        <w:rPr>
+          <w:b/>
+          <w:i/>
+        </w:rPr>
+        <w:t>Note:</w:t>
+      </w:r>
+      <w:r>
+        <w:rPr>
+          <w:b w:val="0"/>
+          <w:i/>
+        </w:rPr>
+        <w:t xml:space="preserve"> Only </w:t>
+      </w:r>
+      <w:r>
+        <w:rPr>
+          <w:b/>
+          <w:i/>
+        </w:rPr>
+        <w:t>↓ PDF</w:t>
+      </w:r>
+      <w:r>
+        <w:rPr>
+          <w:b w:val="0"/>
+          <w:i/>
+        </w:rPr>
+        <w:t xml:space="preserve"> exports are archived here — </w:t>
+      </w:r>
+      <w:r>
+        <w:rPr>
+          <w:b/>
+          <w:i/>
+        </w:rPr>
+        <w:t>↓ Word</w:t>
+      </w:r>
+      <w:r>
+        <w:rPr>
+          <w:b w:val="0"/>
+          <w:i/>
+        </w:rPr>
+        <w:t xml:space="preserve"> (.docx) exports download directly to your browser and are not saved to this page. Deleting a report here only removes the saved copy on the server; it does not affect any copy you've already downloaded to your computer.</w:t>
       </w:r>
     </w:p>
     <w:p>
@@ -20985,28 +21270,28 @@
           <w:b/>
           <w:i w:val="0"/>
         </w:rPr>
-        <w:t>Save Report</w:t>
-      </w:r>
-      <w:r>
-        <w:rPr>
-          <w:b w:val="0"/>
-          <w:i w:val="0"/>
-        </w:rPr>
-        <w:t xml:space="preserve"> (hard save) to persist the report for future revisiting, or go straight to </w:t>
+        <w:t>↓ PDF</w:t>
+      </w:r>
+      <w:r>
+        <w:rPr>
+          <w:b w:val="0"/>
+          <w:i w:val="0"/>
+        </w:rPr>
+        <w:t xml:space="preserve"> to export and automatically archive a copy to </w:t>
       </w:r>
       <w:r>
         <w:rPr>
           <w:b/>
           <w:i w:val="0"/>
         </w:rPr>
-        <w:t>↓ PDF</w:t>
-      </w:r>
-      <w:r>
-        <w:rPr>
-          <w:b w:val="0"/>
-          <w:i w:val="0"/>
-        </w:rPr>
-        <w:t xml:space="preserve"> / </w:t>
+        <w:t>Generated Reports</w:t>
+      </w:r>
+      <w:r>
+        <w:rPr>
+          <w:b w:val="0"/>
+          <w:i w:val="0"/>
+        </w:rPr>
+        <w:t xml:space="preserve">, or </w:t>
       </w:r>
       <w:r>
         <w:rPr>
@@ -21020,7 +21305,7 @@
           <w:b w:val="0"/>
           <w:i w:val="0"/>
         </w:rPr>
-        <w:t xml:space="preserve"> to export.</w:t>
+        <w:t xml:space="preserve"> for a directly-downloaded, editable .docx (not archived).</w:t>
       </w:r>
     </w:p>
     <w:p>
@@ -21200,6 +21485,18 @@
     </w:p>
     <w:p>
       <w:pPr>
+        <w:pStyle w:val="ListBullet"/>
+      </w:pPr>
+      <w:r>
+        <w:rPr>
+          <w:b w:val="0"/>
+          <w:i w:val="0"/>
+        </w:rPr>
+        <w:t>6.9 Editing Required Columns and Affects</w:t>
+      </w:r>
+    </w:p>
+    <w:p>
+      <w:pPr>
         <w:pBdr>
           <w:bottom w:val="single" w:sz="6" w:space="1" w:color="A0AEC0"/>
         </w:pBdr>
@@ -21297,7 +21594,99 @@
           <w:b w:val="0"/>
           <w:i w:val="0"/>
         </w:rPr>
-        <w:t>, indicates the expected column index in the source data</w:t>
+        <w:t xml:space="preserve">, indicates the expected column index in the source data. Layers uploaded with this field left blank show </w:t>
+      </w:r>
+      <w:r>
+        <w:rPr>
+          <w:rFonts w:ascii="Consolas" w:hAnsi="Consolas"/>
+          <w:b w:val="0"/>
+          <w:i w:val="0"/>
+        </w:rPr>
+        <w:t>Required Columns: None</w:t>
+      </w:r>
+    </w:p>
+    <w:p>
+      <w:pPr>
+        <w:pStyle w:val="ListBullet"/>
+      </w:pPr>
+      <w:r>
+        <w:rPr>
+          <w:b/>
+          <w:i w:val="0"/>
+        </w:rPr>
+        <w:t>Affects</w:t>
+      </w:r>
+      <w:r>
+        <w:rPr>
+          <w:b w:val="0"/>
+          <w:i w:val="0"/>
+        </w:rPr>
+        <w:t>: See which PSAT attribute(s) the layer feeds into, and under which category (</w:t>
+      </w:r>
+      <w:r>
+        <w:rPr>
+          <w:b/>
+          <w:i w:val="0"/>
+        </w:rPr>
+        <w:t>For Auto Coding</w:t>
+      </w:r>
+      <w:r>
+        <w:rPr>
+          <w:b w:val="0"/>
+          <w:i w:val="0"/>
+        </w:rPr>
+        <w:t xml:space="preserve">, </w:t>
+      </w:r>
+      <w:r>
+        <w:rPr>
+          <w:b/>
+          <w:i w:val="0"/>
+        </w:rPr>
+        <w:t>For Area Based Reports</w:t>
+      </w:r>
+      <w:r>
+        <w:rPr>
+          <w:b w:val="0"/>
+          <w:i w:val="0"/>
+        </w:rPr>
+        <w:t xml:space="preserve">, or </w:t>
+      </w:r>
+      <w:r>
+        <w:rPr>
+          <w:b/>
+          <w:i w:val="0"/>
+        </w:rPr>
+        <w:t>For Analysis</w:t>
+      </w:r>
+      <w:r>
+        <w:rPr>
+          <w:b w:val="0"/>
+          <w:i w:val="0"/>
+        </w:rPr>
+        <w:t xml:space="preserve">) — shown as </w:t>
+      </w:r>
+      <w:r>
+        <w:rPr>
+          <w:rFonts w:ascii="Consolas" w:hAnsi="Consolas"/>
+          <w:b w:val="0"/>
+          <w:i w:val="0"/>
+        </w:rPr>
+        <w:t>Category: Attribute</w:t>
+      </w:r>
+      <w:r>
+        <w:rPr>
+          <w:b w:val="0"/>
+          <w:i w:val="0"/>
+        </w:rPr>
+        <w:t xml:space="preserve">, e.g. </w:t>
+      </w:r>
+      <w:r>
+        <w:rPr>
+          <w:rFonts w:ascii="Consolas" w:hAnsi="Consolas"/>
+          <w:b w:val="0"/>
+          <w:i w:val="0"/>
+        </w:rPr>
+        <w:t>For Auto Coding: Facility Width</w:t>
       </w:r>
     </w:p>
     <w:p>
@@ -21552,27 +21941,8 @@
             <w:tcW w:type="dxa" w:w="1728"/>
           </w:tcPr>
           <w:p>
-            <w:r/>
-            <w:r>
-              <w:rPr>
-                <w:b w:val="0"/>
-                <w:i w:val="0"/>
-              </w:rPr>
-              <w:t>LinkID</w:t>
-            </w:r>
-            <w:r>
-              <w:rPr>
-                <w:b w:val="0"/>
-                <w:i/>
-              </w:rPr>
-              <w:t>Shape</w:t>
-            </w:r>
-            <w:r>
-              <w:rPr>
-                <w:b w:val="0"/>
-                <w:i w:val="0"/>
-              </w:rPr>
-              <w:t>File</w:t>
+            <w:r>
+              <w:t>LinkID_Shape_File</w:t>
             </w:r>
           </w:p>
         </w:tc>
@@ -21645,27 +22015,8 @@
             <w:tcW w:type="dxa" w:w="1728"/>
           </w:tcPr>
           <w:p>
-            <w:r/>
-            <w:r>
-              <w:rPr>
-                <w:b w:val="0"/>
-                <w:i w:val="0"/>
-              </w:rPr>
-              <w:t>LinkID</w:t>
-            </w:r>
-            <w:r>
-              <w:rPr>
-                <w:b w:val="0"/>
-                <w:i/>
-              </w:rPr>
-              <w:t>Shape</w:t>
-            </w:r>
-            <w:r>
-              <w:rPr>
-                <w:b w:val="0"/>
-                <w:i w:val="0"/>
-              </w:rPr>
-              <w:t>File</w:t>
+            <w:r>
+              <w:t>LinkID_Shape_File</w:t>
             </w:r>
           </w:p>
         </w:tc>
@@ -23996,6 +24347,104 @@
           <w:b/>
           <w:i w:val="0"/>
         </w:rPr>
+        <w:t>File Upload</w:t>
+      </w:r>
+      <w:r>
+        <w:rPr>
+          <w:b w:val="0"/>
+          <w:i w:val="0"/>
+        </w:rPr>
+        <w:t>: Drag and drop your GIS files, or click to browse. For shapefiles, ensure you upload all companion files together (</w:t>
+      </w:r>
+      <w:r>
+        <w:rPr>
+          <w:rFonts w:ascii="Consolas" w:hAnsi="Consolas"/>
+          <w:b w:val="0"/>
+          <w:i w:val="0"/>
+        </w:rPr>
+        <w:t>.shp</w:t>
+      </w:r>
+      <w:r>
+        <w:rPr>
+          <w:b w:val="0"/>
+          <w:i w:val="0"/>
+        </w:rPr>
+        <w:t xml:space="preserve">, </w:t>
+      </w:r>
+      <w:r>
+        <w:rPr>
+          <w:rFonts w:ascii="Consolas" w:hAnsi="Consolas"/>
+          <w:b w:val="0"/>
+          <w:i w:val="0"/>
+        </w:rPr>
+        <w:t>.shx</w:t>
+      </w:r>
+      <w:r>
+        <w:rPr>
+          <w:b w:val="0"/>
+          <w:i w:val="0"/>
+        </w:rPr>
+        <w:t xml:space="preserve">, </w:t>
+      </w:r>
+      <w:r>
+        <w:rPr>
+          <w:rFonts w:ascii="Consolas" w:hAnsi="Consolas"/>
+          <w:b w:val="0"/>
+          <w:i w:val="0"/>
+        </w:rPr>
+        <w:t>.dbf</w:t>
+      </w:r>
+      <w:r>
+        <w:rPr>
+          <w:b w:val="0"/>
+          <w:i w:val="0"/>
+        </w:rPr>
+        <w:t xml:space="preserve">, </w:t>
+      </w:r>
+      <w:r>
+        <w:rPr>
+          <w:rFonts w:ascii="Consolas" w:hAnsi="Consolas"/>
+          <w:b w:val="0"/>
+          <w:i w:val="0"/>
+        </w:rPr>
+        <w:t>.prj</w:t>
+      </w:r>
+      <w:r>
+        <w:rPr>
+          <w:b w:val="0"/>
+          <w:i w:val="0"/>
+        </w:rPr>
+        <w:t>).</w:t>
+      </w:r>
+    </w:p>
+    <w:p>
+      <w:pPr>
+        <w:pStyle w:val="ListBullet"/>
+      </w:pPr>
+      <w:r>
+        <w:rPr>
+          <w:b/>
+          <w:i w:val="0"/>
+        </w:rPr>
+        <w:t>Preview</w:t>
+      </w:r>
+      <w:r>
+        <w:rPr>
+          <w:b w:val="0"/>
+          <w:i w:val="0"/>
+        </w:rPr>
+        <w:t>: Once files are selected, you can preview the geometry on the map before finalising.</w:t>
+      </w:r>
+    </w:p>
+    <w:p>
+      <w:pPr>
+        <w:pStyle w:val="ListBullet"/>
+      </w:pPr>
+      <w:r>
+        <w:rPr>
+          <w:b/>
+          <w:i w:val="0"/>
+        </w:rPr>
         <w:t>New Category</w:t>
       </w:r>
       <w:r>
@@ -24030,14 +24479,28 @@
           <w:b/>
           <w:i w:val="0"/>
         </w:rPr>
-        <w:t>File Upload</w:t>
-      </w:r>
-      <w:r>
-        <w:rPr>
-          <w:b w:val="0"/>
-          <w:i w:val="0"/>
-        </w:rPr>
-        <w:t>: Drag and drop your GIS files. For shapefiles, ensure you upload all companion files together (</w:t>
+        <w:t>Required Columns</w:t>
+      </w:r>
+      <w:r>
+        <w:rPr>
+          <w:b w:val="0"/>
+          <w:i w:val="0"/>
+        </w:rPr>
+        <w:t xml:space="preserve"> </w:t>
+      </w:r>
+      <w:r>
+        <w:rPr>
+          <w:b w:val="0"/>
+          <w:i/>
+        </w:rPr>
+        <w:t>(optional)</w:t>
+      </w:r>
+      <w:r>
+        <w:rPr>
+          <w:b w:val="0"/>
+          <w:i w:val="0"/>
+        </w:rPr>
+        <w:t xml:space="preserve">: Enter the column name(s) the new layer contains, e.g. </w:t>
       </w:r>
       <w:r>
         <w:rPr>
@@ -24045,7 +24508,54 @@
           <w:b w:val="0"/>
           <w:i w:val="0"/>
         </w:rPr>
-        <w:t>.shp</w:t>
+        <w:t>WIDTH, SURFACE_TYPE</w:t>
+      </w:r>
+      <w:r>
+        <w:rPr>
+          <w:b w:val="0"/>
+          <w:i w:val="0"/>
+        </w:rPr>
+        <w:t>. This field can be left blank if you don't need to record any.</w:t>
+      </w:r>
+    </w:p>
+    <w:p>
+      <w:pPr>
+        <w:pStyle w:val="ListBullet"/>
+      </w:pPr>
+      <w:r>
+        <w:rPr>
+          <w:b/>
+          <w:i w:val="0"/>
+        </w:rPr>
+        <w:t>Affects</w:t>
+      </w:r>
+      <w:r>
+        <w:rPr>
+          <w:b w:val="0"/>
+          <w:i w:val="0"/>
+        </w:rPr>
+        <w:t xml:space="preserve"> </w:t>
+      </w:r>
+      <w:r>
+        <w:rPr>
+          <w:b w:val="0"/>
+          <w:i/>
+        </w:rPr>
+        <w:t>(mandatory)</w:t>
+      </w:r>
+      <w:r>
+        <w:rPr>
+          <w:b w:val="0"/>
+          <w:i w:val="0"/>
+        </w:rPr>
+        <w:t xml:space="preserve">: First choose which category this layer belongs to — </w:t>
+      </w:r>
+      <w:r>
+        <w:rPr>
+          <w:b/>
+          <w:i w:val="0"/>
+        </w:rPr>
+        <w:t>For Auto Coding</w:t>
       </w:r>
       <w:r>
         <w:rPr>
@@ -24056,18 +24566,160 @@
       </w:r>
       <w:r>
         <w:rPr>
+          <w:b/>
+          <w:i w:val="0"/>
+        </w:rPr>
+        <w:t>For Area Based Reports</w:t>
+      </w:r>
+      <w:r>
+        <w:rPr>
+          <w:b w:val="0"/>
+          <w:i w:val="0"/>
+        </w:rPr>
+        <w:t xml:space="preserve">, or </w:t>
+      </w:r>
+      <w:r>
+        <w:rPr>
+          <w:b/>
+          <w:i w:val="0"/>
+        </w:rPr>
+        <w:t>For Analysis</w:t>
+      </w:r>
+      <w:r>
+        <w:rPr>
+          <w:b w:val="0"/>
+          <w:i w:val="0"/>
+        </w:rPr>
+        <w:t xml:space="preserve"> — then tick the specific attribute(s) within that category that this layer affects (e.g. Facility Width, Curvature). To add an attribute that isn't listed, type it into </w:t>
+      </w:r>
+      <w:r>
+        <w:rPr>
+          <w:b/>
+          <w:i w:val="0"/>
+        </w:rPr>
+        <w:t>Add a custom parameter to "…"</w:t>
+      </w:r>
+      <w:r>
+        <w:rPr>
+          <w:b w:val="0"/>
+          <w:i w:val="0"/>
+        </w:rPr>
+        <w:t xml:space="preserve"> and click </w:t>
+      </w:r>
+      <w:r>
+        <w:rPr>
+          <w:b/>
+          <w:i w:val="0"/>
+        </w:rPr>
+        <w:t>Add</w:t>
+      </w:r>
+      <w:r>
+        <w:rPr>
+          <w:b w:val="0"/>
+          <w:i w:val="0"/>
+        </w:rPr>
+        <w:t xml:space="preserve">. Each tick is recorded together with its category, e.g. </w:t>
+      </w:r>
+      <w:r>
+        <w:rPr>
           <w:rFonts w:ascii="Consolas" w:hAnsi="Consolas"/>
           <w:b w:val="0"/>
           <w:i w:val="0"/>
         </w:rPr>
-        <w:t>.shx</w:t>
-      </w:r>
-      <w:r>
-        <w:rPr>
-          <w:b w:val="0"/>
-          <w:i w:val="0"/>
-        </w:rPr>
-        <w:t xml:space="preserve">, </w:t>
+        <w:t>For Auto Coding: Facility Width</w:t>
+      </w:r>
+      <w:r>
+        <w:rPr>
+          <w:b w:val="0"/>
+          <w:i w:val="0"/>
+        </w:rPr>
+        <w:t>, and appears as a removable tag below the checklist. You can switch categories and tick attributes from more than one — at least one attribute must be selected in total before uploading.</w:t>
+      </w:r>
+    </w:p>
+    <w:p>
+      <w:pPr/>
+      <w:r>
+        <w:rPr>
+          <w:b w:val="0"/>
+          <w:i/>
+        </w:rPr>
+        <w:t xml:space="preserve">The </w:t>
+      </w:r>
+      <w:r>
+        <w:rPr>
+          <w:b/>
+          <w:i/>
+        </w:rPr>
+        <w:t>Upload</w:t>
+      </w:r>
+      <w:r>
+        <w:rPr>
+          <w:b w:val="0"/>
+          <w:i/>
+        </w:rPr>
+        <w:t xml:space="preserve"> button stays disabled until you have selected a file and ticked at least one </w:t>
+      </w:r>
+      <w:r>
+        <w:rPr>
+          <w:b/>
+          <w:i/>
+        </w:rPr>
+        <w:t>Affects</w:t>
+      </w:r>
+      <w:r>
+        <w:rPr>
+          <w:b w:val="0"/>
+          <w:i/>
+        </w:rPr>
+        <w:t xml:space="preserve"> attribute.</w:t>
+      </w:r>
+    </w:p>
+    <w:p>
+      <w:pPr>
+        <w:pStyle w:val="Heading3"/>
+      </w:pPr>
+      <w:r>
+        <w:rPr>
+          <w:b w:val="0"/>
+          <w:i w:val="0"/>
+        </w:rPr>
+        <w:t>What You'll See After Uploading</w:t>
+      </w:r>
+    </w:p>
+    <w:p>
+      <w:pPr/>
+      <w:r>
+        <w:rPr>
+          <w:b w:val="0"/>
+          <w:i w:val="0"/>
+        </w:rPr>
+        <w:t>The layer's card on the GIS Layers page displays exactly what you entered on the upload form:</w:t>
+      </w:r>
+    </w:p>
+    <w:p>
+      <w:pPr>
+        <w:pStyle w:val="ListBullet"/>
+      </w:pPr>
+      <w:r>
+        <w:rPr>
+          <w:b w:val="0"/>
+          <w:i w:val="0"/>
+        </w:rPr>
+        <w:t xml:space="preserve">If </w:t>
+      </w:r>
+      <w:r>
+        <w:rPr>
+          <w:b/>
+          <w:i w:val="0"/>
+        </w:rPr>
+        <w:t>Required Columns</w:t>
+      </w:r>
+      <w:r>
+        <w:rPr>
+          <w:b w:val="0"/>
+          <w:i w:val="0"/>
+        </w:rPr>
+        <w:t xml:space="preserve"> was left blank, the card shows </w:t>
       </w:r>
       <w:r>
         <w:rPr>
@@ -24075,14 +24727,33 @@
           <w:b w:val="0"/>
           <w:i w:val="0"/>
         </w:rPr>
-        <w:t>.dbf</w:t>
-      </w:r>
-      <w:r>
-        <w:rPr>
-          <w:b w:val="0"/>
-          <w:i w:val="0"/>
-        </w:rPr>
-        <w:t xml:space="preserve">, </w:t>
+        <w:t>Required Columns: None</w:t>
+      </w:r>
+      <w:r>
+        <w:rPr>
+          <w:b w:val="0"/>
+          <w:i w:val="0"/>
+        </w:rPr>
+        <w:t>.</w:t>
+      </w:r>
+    </w:p>
+    <w:p>
+      <w:pPr>
+        <w:pStyle w:val="ListBullet"/>
+      </w:pPr>
+      <w:r>
+        <w:rPr>
+          <w:b/>
+          <w:i w:val="0"/>
+        </w:rPr>
+        <w:t>Affects</w:t>
+      </w:r>
+      <w:r>
+        <w:rPr>
+          <w:b w:val="0"/>
+          <w:i w:val="0"/>
+        </w:rPr>
+        <w:t xml:space="preserve"> shows every </w:t>
       </w:r>
       <w:r>
         <w:rPr>
@@ -24090,33 +24761,92 @@
           <w:b w:val="0"/>
           <w:i w:val="0"/>
         </w:rPr>
-        <w:t>.prj</w:t>
-      </w:r>
-      <w:r>
-        <w:rPr>
-          <w:b w:val="0"/>
-          <w:i w:val="0"/>
-        </w:rPr>
-        <w:t>).</w:t>
-      </w:r>
-    </w:p>
-    <w:p>
-      <w:pPr>
-        <w:pStyle w:val="ListBullet"/>
-      </w:pPr>
+        <w:t>Category: Attribute</w:t>
+      </w:r>
+      <w:r>
+        <w:rPr>
+          <w:b w:val="0"/>
+          <w:i w:val="0"/>
+        </w:rPr>
+        <w:t xml:space="preserve"> pair you ticked, e.g. </w:t>
+      </w:r>
+      <w:r>
+        <w:rPr>
+          <w:rFonts w:ascii="Consolas" w:hAnsi="Consolas"/>
+          <w:b w:val="0"/>
+          <w:i w:val="0"/>
+        </w:rPr>
+        <w:t>For Auto Coding: Facility Width</w:t>
+      </w:r>
+      <w:r>
+        <w:rPr>
+          <w:b w:val="0"/>
+          <w:i w:val="0"/>
+        </w:rPr>
+        <w:t>. If you ticked attributes from more than one category, all of them are listed.</w:t>
+      </w:r>
+    </w:p>
+    <w:p>
+      <w:pPr/>
       <w:r>
         <w:rPr>
           <w:b/>
           <w:i w:val="0"/>
         </w:rPr>
-        <w:t>Preview</w:t>
-      </w:r>
-      <w:r>
-        <w:rPr>
-          <w:b w:val="0"/>
-          <w:i w:val="0"/>
-        </w:rPr>
-        <w:t>: Once uploaded, you can preview the geometry on the map before finalising.</w:t>
+        <w:t>Example:</w:t>
+      </w:r>
+      <w:r>
+        <w:rPr>
+          <w:b w:val="0"/>
+          <w:i w:val="0"/>
+        </w:rPr>
+        <w:t xml:space="preserve"> You leave Required Columns empty, select the </w:t>
+      </w:r>
+      <w:r>
+        <w:rPr>
+          <w:b/>
+          <w:i w:val="0"/>
+        </w:rPr>
+        <w:t>For Auto Coding</w:t>
+      </w:r>
+      <w:r>
+        <w:rPr>
+          <w:b w:val="0"/>
+          <w:i w:val="0"/>
+        </w:rPr>
+        <w:t xml:space="preserve"> category, and tick </w:t>
+      </w:r>
+      <w:r>
+        <w:rPr>
+          <w:b/>
+          <w:i w:val="0"/>
+        </w:rPr>
+        <w:t>Facility Width</w:t>
+      </w:r>
+      <w:r>
+        <w:rPr>
+          <w:b w:val="0"/>
+          <w:i w:val="0"/>
+        </w:rPr>
+        <w:t>. After uploading, the layer's card reads:</w:t>
+      </w:r>
+    </w:p>
+    <w:p>
+      <w:pPr/>
+      <w:r>
+        <w:rPr>
+          <w:rFonts w:ascii="Consolas" w:hAnsi="Consolas"/>
+        </w:rPr>
+        <w:t>Required Columns: None</w:t>
+      </w:r>
+      <w:r>
+        <w:br/>
+      </w:r>
+      <w:r>
+        <w:rPr>
+          <w:rFonts w:ascii="Consolas" w:hAnsi="Consolas"/>
+        </w:rPr>
+        <w:t>Affects: For Auto Coding: Facility Width</w:t>
       </w:r>
     </w:p>
     <w:p>
@@ -24916,27 +25646,8 @@
             <w:tcW w:type="dxa" w:w="4320"/>
           </w:tcPr>
           <w:p>
-            <w:r/>
-            <w:r>
-              <w:rPr>
-                <w:b w:val="0"/>
-                <w:i w:val="0"/>
-              </w:rPr>
-              <w:t>bus</w:t>
-            </w:r>
-            <w:r>
-              <w:rPr>
-                <w:b w:val="0"/>
-                <w:i/>
-              </w:rPr>
-              <w:t>stop, bus</w:t>
-            </w:r>
-            <w:r>
-              <w:rPr>
-                <w:b w:val="0"/>
-                <w:i w:val="0"/>
-              </w:rPr>
-              <w:t>lane, bus_shelter …</w:t>
+            <w:r>
+              <w:t>bus_stop, bus_lane, bus_shelter …</w:t>
             </w:r>
           </w:p>
         </w:tc>
@@ -24963,27 +25674,8 @@
             <w:tcW w:type="dxa" w:w="4320"/>
           </w:tcPr>
           <w:p>
-            <w:r/>
-            <w:r>
-              <w:rPr>
-                <w:b w:val="0"/>
-                <w:i w:val="0"/>
-              </w:rPr>
-              <w:t>cycling</w:t>
-            </w:r>
-            <w:r>
-              <w:rPr>
-                <w:b w:val="0"/>
-                <w:i/>
-              </w:rPr>
-              <w:t>path, shared</w:t>
-            </w:r>
-            <w:r>
-              <w:rPr>
-                <w:b w:val="0"/>
-                <w:i w:val="0"/>
-              </w:rPr>
-              <w:t>path, footpath, CyclingPath_Jul2024 …</w:t>
+            <w:r>
+              <w:t>cycling_path, shared_path, footpath, CyclingPath_Jul2024 …</w:t>
             </w:r>
           </w:p>
         </w:tc>
@@ -25410,6 +26102,234 @@
           <w:i/>
         </w:rPr>
         <w:t xml:space="preserve"> button only appears on layers that have been given a custom name. Layers still showing their original name will not have this option.</w:t>
+      </w:r>
+    </w:p>
+    <w:p>
+      <w:pPr>
+        <w:pStyle w:val="Heading2"/>
+      </w:pPr>
+      <w:r>
+        <w:rPr>
+          <w:b w:val="0"/>
+          <w:i w:val="0"/>
+        </w:rPr>
+        <w:t>6.9 Editing Required Columns and Affects</w:t>
+      </w:r>
+    </w:p>
+    <w:p>
+      <w:pPr/>
+      <w:r>
+        <w:rPr>
+          <w:b w:val="0"/>
+          <w:i w:val="0"/>
+        </w:rPr>
+        <w:t xml:space="preserve">The </w:t>
+      </w:r>
+      <w:r>
+        <w:rPr>
+          <w:b/>
+          <w:i w:val="0"/>
+        </w:rPr>
+        <w:t>Required Columns</w:t>
+      </w:r>
+      <w:r>
+        <w:rPr>
+          <w:b w:val="0"/>
+          <w:i w:val="0"/>
+        </w:rPr>
+        <w:t xml:space="preserve"> and </w:t>
+      </w:r>
+      <w:r>
+        <w:rPr>
+          <w:b/>
+          <w:i w:val="0"/>
+        </w:rPr>
+        <w:t>Affects</w:t>
+      </w:r>
+      <w:r>
+        <w:rPr>
+          <w:b w:val="0"/>
+          <w:i w:val="0"/>
+        </w:rPr>
+        <w:t xml:space="preserve"> values you entered while uploading a layer (see </w:t>
+      </w:r>
+      <w:r>
+        <w:rPr>
+          <w:b/>
+          <w:i w:val="0"/>
+        </w:rPr>
+        <w:t>Section 6.3</w:t>
+      </w:r>
+      <w:r>
+        <w:rPr>
+          <w:b w:val="0"/>
+          <w:i w:val="0"/>
+        </w:rPr>
+        <w:t>) can be corrected later if needed.</w:t>
+      </w:r>
+    </w:p>
+    <w:p>
+      <w:pPr/>
+      <w:r>
+        <w:rPr>
+          <w:b/>
+          <w:i w:val="0"/>
+        </w:rPr>
+        <w:t>Steps:</w:t>
+      </w:r>
+    </w:p>
+    <w:p>
+      <w:pPr>
+        <w:pStyle w:val="ListNumber"/>
+      </w:pPr>
+      <w:r>
+        <w:rPr>
+          <w:b w:val="0"/>
+          <w:i w:val="0"/>
+        </w:rPr>
+        <w:t>Open the GIS Layers page from the sidebar</w:t>
+      </w:r>
+    </w:p>
+    <w:p>
+      <w:pPr>
+        <w:pStyle w:val="ListNumber"/>
+      </w:pPr>
+      <w:r>
+        <w:rPr>
+          <w:b w:val="0"/>
+          <w:i w:val="0"/>
+        </w:rPr>
+        <w:t>Locate the layer you want to update</w:t>
+      </w:r>
+    </w:p>
+    <w:p>
+      <w:pPr>
+        <w:pStyle w:val="ListNumber"/>
+      </w:pPr>
+      <w:r>
+        <w:rPr>
+          <w:b w:val="0"/>
+          <w:i w:val="0"/>
+        </w:rPr>
+        <w:t xml:space="preserve">Click the </w:t>
+      </w:r>
+      <w:r>
+        <w:rPr>
+          <w:b/>
+          <w:i w:val="0"/>
+        </w:rPr>
+        <w:t>Params</w:t>
+      </w:r>
+      <w:r>
+        <w:rPr>
+          <w:b w:val="0"/>
+          <w:i w:val="0"/>
+        </w:rPr>
+        <w:t xml:space="preserve"> (or </w:t>
+      </w:r>
+      <w:r>
+        <w:rPr>
+          <w:b/>
+          <w:i w:val="0"/>
+        </w:rPr>
+        <w:t>Edit</w:t>
+      </w:r>
+      <w:r>
+        <w:rPr>
+          <w:b w:val="0"/>
+          <w:i w:val="0"/>
+        </w:rPr>
+        <w:t>) button on the layer row</w:t>
+      </w:r>
+    </w:p>
+    <w:p>
+      <w:pPr>
+        <w:pStyle w:val="ListNumber"/>
+      </w:pPr>
+      <w:r>
+        <w:rPr>
+          <w:b w:val="0"/>
+          <w:i w:val="0"/>
+        </w:rPr>
+        <w:t xml:space="preserve">Update the </w:t>
+      </w:r>
+      <w:r>
+        <w:rPr>
+          <w:b/>
+          <w:i w:val="0"/>
+        </w:rPr>
+        <w:t>Affects</w:t>
+      </w:r>
+      <w:r>
+        <w:rPr>
+          <w:b w:val="0"/>
+          <w:i w:val="0"/>
+        </w:rPr>
+        <w:t xml:space="preserve"> selections and/or </w:t>
+      </w:r>
+      <w:r>
+        <w:rPr>
+          <w:b/>
+          <w:i w:val="0"/>
+        </w:rPr>
+        <w:t>Required Columns</w:t>
+      </w:r>
+      <w:r>
+        <w:rPr>
+          <w:b w:val="0"/>
+          <w:i w:val="0"/>
+        </w:rPr>
+        <w:t xml:space="preserve"> text</w:t>
+      </w:r>
+    </w:p>
+    <w:p>
+      <w:pPr>
+        <w:pStyle w:val="ListNumber"/>
+      </w:pPr>
+      <w:r>
+        <w:rPr>
+          <w:b w:val="0"/>
+          <w:i w:val="0"/>
+        </w:rPr>
+        <w:t xml:space="preserve">Click </w:t>
+      </w:r>
+      <w:r>
+        <w:rPr>
+          <w:b/>
+          <w:i w:val="0"/>
+        </w:rPr>
+        <w:t>Save</w:t>
+      </w:r>
+    </w:p>
+    <w:p>
+      <w:pPr/>
+      <w:r>
+        <w:rPr>
+          <w:b/>
+          <w:i/>
+        </w:rPr>
+        <w:t>Only layers you have uploaded through Add GIS Layer can have their Required Columns / Affects edited.</w:t>
+      </w:r>
+      <w:r>
+        <w:rPr>
+          <w:b w:val="0"/>
+          <w:i/>
+        </w:rPr>
+        <w:t xml:space="preserve"> The built-in shapefiles that ship with PSAT, and any layer that already existed before this feature, are read-only for these two fields — the </w:t>
+      </w:r>
+      <w:r>
+        <w:rPr>
+          <w:b/>
+          <w:i/>
+        </w:rPr>
+        <w:t>Params</w:t>
+      </w:r>
+      <w:r>
+        <w:rPr>
+          <w:b w:val="0"/>
+          <w:i/>
+        </w:rPr>
+        <w:t xml:space="preserve"> button is disabled for them. This does not change what columns the scoring engine actually reads; it only corrects the informational labels shown in the GIS Layers list.</w:t>
       </w:r>
     </w:p>
     <w:sectPr>

</xml_diff>

<commit_message>
Documentation and guides changes
</commit_message>
<xml_diff>
--- a/USER_GUIDE_(UPDATED)V4.docx
+++ b/USER_GUIDE_(UPDATED)V4.docx
@@ -23223,7 +23223,7 @@
                 <w:b w:val="0"/>
                 <w:i w:val="0"/>
               </w:rPr>
-              <w:t>Point / Polygon</w:t>
+              <w:t>Point</w:t>
             </w:r>
           </w:p>
         </w:tc>
@@ -23975,7 +23975,7 @@
                 <w:b w:val="0"/>
                 <w:i w:val="0"/>
               </w:rPr>
-              <w:t>LineString / Point</w:t>
+              <w:t>LineString</w:t>
             </w:r>
           </w:p>
         </w:tc>

</xml_diff>

<commit_message>
Updated User guide with new images for curvature, ran a quick fix for profiles and added highlights for table of contents
</commit_message>
<xml_diff>
--- a/USER_GUIDE_(UPDATED)V4.docx
+++ b/USER_GUIDE_(UPDATED)V4.docx
@@ -9927,19 +9927,42 @@
       </w:r>
     </w:p>
     <w:p>
-      <w:r>
-        <w:rPr>
-          <w:b w:val="0"/>
-          <w:i w:val="0"/>
-        </w:rPr>
-        <w:t>!</w:t>
-      </w:r>
-      <w:r>
-        <w:rPr>
-          <w:b w:val="0"/>
-          <w:i w:val="0"/>
-        </w:rPr>
-        <w:t>5m buffer zone diagram</w:t>
+      <w:pPr>
+        <w:jc w:val="center"/>
+      </w:pPr>
+      <w:r>
+        <w:drawing>
+          <wp:inline xmlns:a="http://schemas.openxmlformats.org/drawingml/2006/main" xmlns:pic="http://schemas.openxmlformats.org/drawingml/2006/picture">
+            <wp:extent cx="5486400" cy="3086100"/>
+            <wp:docPr id="1" name="Picture 1"/>
+            <wp:cNvGraphicFramePr>
+              <a:graphicFrameLocks noChangeAspect="1"/>
+            </wp:cNvGraphicFramePr>
+            <a:graphic>
+              <a:graphicData uri="http://schemas.openxmlformats.org/drawingml/2006/picture">
+                <pic:pic>
+                  <pic:nvPicPr>
+                    <pic:cNvPr id="0" name="image4.png"/>
+                    <pic:cNvPicPr/>
+                  </pic:nvPicPr>
+                  <pic:blipFill>
+                    <a:blip r:embed="rId10"/>
+                    <a:stretch>
+                      <a:fillRect/>
+                    </a:stretch>
+                  </pic:blipFill>
+                  <pic:spPr>
+                    <a:xfrm>
+                      <a:off x="0" y="0"/>
+                      <a:ext cx="5486400" cy="3086100"/>
+                    </a:xfrm>
+                    <a:prstGeom prst="rect"/>
+                  </pic:spPr>
+                </pic:pic>
+              </a:graphicData>
+            </a:graphic>
+          </wp:inline>
+        </w:drawing>
       </w:r>
     </w:p>
     <w:p>
@@ -10011,19 +10034,42 @@
       </w:r>
     </w:p>
     <w:p>
-      <w:r>
-        <w:rPr>
-          <w:b w:val="0"/>
-          <w:i w:val="0"/>
-        </w:rPr>
-        <w:t>!</w:t>
-      </w:r>
-      <w:r>
-        <w:rPr>
-          <w:b w:val="0"/>
-          <w:i w:val="0"/>
-        </w:rPr>
-        <w:t>Triplet lopsided rejection diagram</w:t>
+      <w:pPr>
+        <w:jc w:val="center"/>
+      </w:pPr>
+      <w:r>
+        <w:drawing>
+          <wp:inline xmlns:a="http://schemas.openxmlformats.org/drawingml/2006/main" xmlns:pic="http://schemas.openxmlformats.org/drawingml/2006/picture">
+            <wp:extent cx="5486400" cy="3086100"/>
+            <wp:docPr id="2" name="Picture 2"/>
+            <wp:cNvGraphicFramePr>
+              <a:graphicFrameLocks noChangeAspect="1"/>
+            </wp:cNvGraphicFramePr>
+            <a:graphic>
+              <a:graphicData uri="http://schemas.openxmlformats.org/drawingml/2006/picture">
+                <pic:pic>
+                  <pic:nvPicPr>
+                    <pic:cNvPr id="0" name="image5.png"/>
+                    <pic:cNvPicPr/>
+                  </pic:nvPicPr>
+                  <pic:blipFill>
+                    <a:blip r:embed="rId11"/>
+                    <a:stretch>
+                      <a:fillRect/>
+                    </a:stretch>
+                  </pic:blipFill>
+                  <pic:spPr>
+                    <a:xfrm>
+                      <a:off x="0" y="0"/>
+                      <a:ext cx="5486400" cy="3086100"/>
+                    </a:xfrm>
+                    <a:prstGeom prst="rect"/>
+                  </pic:spPr>
+                </pic:pic>
+              </a:graphicData>
+            </a:graphic>
+          </wp:inline>
+        </w:drawing>
       </w:r>
     </w:p>
     <w:p>
@@ -10084,19 +10130,42 @@
       </w:r>
     </w:p>
     <w:p>
-      <w:r>
-        <w:rPr>
-          <w:b w:val="0"/>
-          <w:i w:val="0"/>
-        </w:rPr>
-        <w:t>!</w:t>
-      </w:r>
-      <w:r>
-        <w:rPr>
-          <w:b w:val="0"/>
-          <w:i w:val="0"/>
-        </w:rPr>
-        <w:t>Path intersection deflection angle diagram</w:t>
+      <w:pPr>
+        <w:jc w:val="center"/>
+      </w:pPr>
+      <w:r>
+        <w:drawing>
+          <wp:inline xmlns:a="http://schemas.openxmlformats.org/drawingml/2006/main" xmlns:pic="http://schemas.openxmlformats.org/drawingml/2006/picture">
+            <wp:extent cx="5486400" cy="3086100"/>
+            <wp:docPr id="3" name="Picture 3"/>
+            <wp:cNvGraphicFramePr>
+              <a:graphicFrameLocks noChangeAspect="1"/>
+            </wp:cNvGraphicFramePr>
+            <a:graphic>
+              <a:graphicData uri="http://schemas.openxmlformats.org/drawingml/2006/picture">
+                <pic:pic>
+                  <pic:nvPicPr>
+                    <pic:cNvPr id="0" name="image6.png"/>
+                    <pic:cNvPicPr/>
+                  </pic:nvPicPr>
+                  <pic:blipFill>
+                    <a:blip r:embed="rId12"/>
+                    <a:stretch>
+                      <a:fillRect/>
+                    </a:stretch>
+                  </pic:blipFill>
+                  <pic:spPr>
+                    <a:xfrm>
+                      <a:off x="0" y="0"/>
+                      <a:ext cx="5486400" cy="3086100"/>
+                    </a:xfrm>
+                    <a:prstGeom prst="rect"/>
+                  </pic:spPr>
+                </pic:pic>
+              </a:graphicData>
+            </a:graphic>
+          </wp:inline>
+        </w:drawing>
       </w:r>
     </w:p>
     <w:p>

</xml_diff>